<commit_message>
docs(fase2): alinea entregables con Retro S03 cerrada y RNF 1.0.2
Sincroniza Word/md 2.3-2.6 e individuales con acta S03 (15/10), Goal Parcial y catálogo v1.0.2; DOC-07 Pruebas S03 v0.4; reemplaza § por ver Seccion y em dash por guion; añade scripts fase2/_tools. Actas S01/S02 firmadas sin reescribir.

Co-authored-by: Cursor <cursoragent@cursor.com>
</commit_message>
<xml_diff>
--- a/fase2/Evidencias Grupales/2.6_GuiaEstudiante_Fase 2_Informe Final Proyecto APT.docx
+++ b/fase2/Evidencias Grupales/2.6_GuiaEstudiante_Fase 2_Informe Final Proyecto APT.docx
@@ -267,28 +267,6 @@
     <w:p/>
     <w:p/>
     <w:p/>
-    <w:p>
-      <w:pPr>
-        <w:rPr>
-          <w:rFonts w:asciiTheme="majorHAnsi" w:eastAsiaTheme="majorEastAsia" w:hAnsiTheme="majorHAnsi" w:cstheme="majorBidi"/>
-          <w:b/>
-          <w:color w:val="2F5496" w:themeColor="accent1" w:themeShade="BF"/>
-          <w:sz w:val="26"/>
-          <w:szCs w:val="26"/>
-        </w:rPr>
-      </w:pPr>
-    </w:p>
-    <w:p>
-      <w:pPr>
-        <w:rPr>
-          <w:rFonts w:asciiTheme="majorHAnsi" w:eastAsiaTheme="majorEastAsia" w:hAnsiTheme="majorHAnsi" w:cstheme="majorBidi"/>
-          <w:b/>
-          <w:color w:val="2F5496" w:themeColor="accent1" w:themeShade="BF"/>
-          <w:sz w:val="26"/>
-          <w:szCs w:val="26"/>
-        </w:rPr>
-      </w:pPr>
-    </w:p>
     <w:tbl>
       <w:tblPr>
         <w:tblStyle w:val="Tablaconcuadrcula"/>
@@ -596,6 +574,13 @@
         </w:tc>
       </w:tr>
     </w:tbl>
+    <w:p>
+      <w:pPr>
+        <w:rPr>
+          <w:b/>
+        </w:rPr>
+      </w:pPr>
+    </w:p>
     <w:p>
       <w:pPr>
         <w:rPr>
@@ -645,6 +630,7 @@
                 <w:color w:val="1F3864" w:themeColor="accent1" w:themeShade="80"/>
                 <w:sz w:val="18"/>
               </w:rPr>
+              <w:lastRenderedPageBreak/>
               <w:t>Contenidos de</w:t>
             </w:r>
             <w:r>
@@ -668,7 +654,7 @@
       </w:tr>
       <w:tr>
         <w:trPr>
-          <w:trHeight w:val="2266"/>
+          <w:trHeight w:val="1014"/>
         </w:trPr>
         <w:tc>
           <w:tcPr>
@@ -707,12 +693,7 @@
           <w:p>
             <w:pPr>
               <w:pStyle w:val="paragraph"/>
-              <w:numPr>
-                <w:ilvl w:val="0"/>
-                <w:numId w:val="6"/>
-              </w:numPr>
               <w:spacing w:before="0" w:beforeAutospacing="0" w:after="120" w:afterAutospacing="0" w:line="360" w:lineRule="auto"/>
-              <w:ind w:left="301" w:hanging="283"/>
               <w:jc w:val="both"/>
               <w:textAlignment w:val="baseline"/>
               <w:rPr>
@@ -733,6 +714,9 @@
           <w:p>
             <w:pPr>
               <w:spacing w:after="120"/>
+              <w:rPr>
+                <w:rFonts w:cs="Calibri"/>
+              </w:rPr>
             </w:pPr>
             <w:r>
               <w:rPr>
@@ -763,7 +747,25 @@
               <w:rPr>
                 <w:rFonts w:cs="Calibri"/>
               </w:rPr>
-              <w:t>Dónde se ubica. En Chile, en el mercado de comercios que usan el POS de Dtemite para vender, cobrar y emitir documentos tributarios electrónicos. El mercado de pagos digitales en Chile ha diversificado sus canales (pasarelas web, billeteras digitales y transferencias), y los comercios que dependen solo de hardware físico quedan en desventaja.</w:t>
+              <w:t>¿</w:t>
+            </w:r>
+            <w:r>
+              <w:rPr>
+                <w:rFonts w:cs="Calibri"/>
+              </w:rPr>
+              <w:t>Dónde se ubica</w:t>
+            </w:r>
+            <w:r>
+              <w:rPr>
+                <w:rFonts w:cs="Calibri"/>
+              </w:rPr>
+              <w:t>?; en</w:t>
+            </w:r>
+            <w:r>
+              <w:rPr>
+                <w:rFonts w:cs="Calibri"/>
+              </w:rPr>
+              <w:t xml:space="preserve"> Chile, en el mercado de comercios que usan el POS de Dtemite para vender, cobrar y emitir documentos tributarios electrónicos. El mercado de pagos digitales en Chile ha diversificado sus canales (pasarelas web, billeteras digitales y transferencias), y los comercios que dependen solo de hardware físico quedan en desventaja.</w:t>
             </w:r>
           </w:p>
           <w:p>
@@ -780,12 +782,26 @@
           <w:p>
             <w:pPr>
               <w:spacing w:after="120"/>
-            </w:pPr>
-            <w:r>
-              <w:rPr>
-                <w:rFonts w:cs="Calibri"/>
-              </w:rPr>
-              <w:t>Aporte de valor. Una capa PaymentGateway que ya convive con el cobro TUU/Kozen en producción y agrega Webpay Plus en un celular genérico, con el dato de tarjeta fuera del dispositivo y las credenciales de Transbank fuera del APK. Al 12/10/2026 el valor es demostrable en el ambiente de integración de Transbank (aprobado y rechazado PASS). La operación con comercios reales requiere las credenciales de producción y la emisión de DTE, todavía pendientes.</w:t>
+              <w:rPr>
+                <w:rFonts w:cs="Calibri"/>
+              </w:rPr>
+            </w:pPr>
+            <w:r>
+              <w:rPr>
+                <w:rFonts w:cs="Calibri"/>
+              </w:rPr>
+              <w:t xml:space="preserve">Aporte de valor. Una capa PaymentGateway que ya convive con el cobro TUU/Kozen en producción y agrega Webpay Plus en un celular genérico, con el dato de tarjeta fuera del dispositivo y las credenciales de Transbank fuera del APK. Al 12/10/2026 el valor es demostrable en el ambiente de integración de Transbank (aprobado y rechazado PASS). </w:t>
+            </w:r>
+          </w:p>
+          <w:p>
+            <w:pPr>
+              <w:spacing w:after="120"/>
+            </w:pPr>
+            <w:r>
+              <w:rPr>
+                <w:rFonts w:cs="Calibri"/>
+              </w:rPr>
+              <w:t>La operación con comercios reales requiere las credenciales de producción y la emisión de DTE, todavía pendientes.</w:t>
             </w:r>
           </w:p>
         </w:tc>
@@ -822,13 +838,7 @@
           </w:tcPr>
           <w:p>
             <w:pPr>
-              <w:pStyle w:val="Prrafodelista"/>
-              <w:numPr>
-                <w:ilvl w:val="0"/>
-                <w:numId w:val="1"/>
-              </w:numPr>
               <w:spacing w:after="120"/>
-              <w:ind w:left="314" w:hanging="284"/>
               <w:jc w:val="both"/>
               <w:rPr>
                 <w:rFonts w:cs="Arial"/>
@@ -843,7 +853,19 @@
               <w:rPr>
                 <w:rFonts w:cs="Calibri"/>
               </w:rPr>
-              <w:t>Objetivo general. Diseñar e implementar una arquitectura de pagos extensible para el sistema D-PAY, que permita incorporar múltiples pasarelas de pago digitales de forma desacoplada, utilizando Webpay como implementación mínima viable durante el semestre (Equipo D-PAY 3.0, 2026c).</w:t>
+              <w:t>Objetivo general</w:t>
+            </w:r>
+            <w:r>
+              <w:rPr>
+                <w:rFonts w:cs="Calibri"/>
+              </w:rPr>
+              <w:t>;</w:t>
+            </w:r>
+            <w:r>
+              <w:rPr>
+                <w:rFonts w:cs="Calibri"/>
+              </w:rPr>
+              <w:t xml:space="preserve"> Diseñar e implementar una arquitectura de pagos extensible para el sistema D-PAY, que permita incorporar múltiples pasarelas de pago digitales de forma desacoplada, utilizando Webpay como implementación mínima viable durante el semestre (Equipo D-PAY 3.0, 2026c).</w:t>
             </w:r>
           </w:p>
           <w:p>
@@ -865,7 +887,19 @@
               <w:rPr>
                 <w:rFonts w:cs="Calibri"/>
               </w:rPr>
-              <w:t xml:space="preserve">1. Levantar y documentar la arquitectura de pagos actual de D-PAY y su dependencia del hardware TUU/Kozen — Cumplido (inventario </w:t>
+              <w:t xml:space="preserve">1. Levantar y documentar la arquitectura de pagos actual de D-PAY y su dependencia del hardware TUU/Kozen </w:t>
+            </w:r>
+            <w:r>
+              <w:rPr>
+                <w:rFonts w:cs="Calibri"/>
+              </w:rPr>
+              <w:t>-</w:t>
+            </w:r>
+            <w:r>
+              <w:rPr>
+                <w:rFonts w:cs="Calibri"/>
+              </w:rPr>
+              <w:t xml:space="preserve"> Cumplido (inventario </w:t>
             </w:r>
             <w:proofErr w:type="spellStart"/>
             <w:r>
@@ -904,7 +938,19 @@
               <w:rPr>
                 <w:rFonts w:cs="Calibri"/>
               </w:rPr>
-              <w:t xml:space="preserve"> que desacople la lógica de negocio de cada pasarela — Cumplido (</w:t>
+              <w:t xml:space="preserve"> que desacople la lógica de negocio de cada pasarela </w:t>
+            </w:r>
+            <w:r>
+              <w:rPr>
+                <w:rFonts w:cs="Calibri"/>
+              </w:rPr>
+              <w:t>-</w:t>
+            </w:r>
+            <w:r>
+              <w:rPr>
+                <w:rFonts w:cs="Calibri"/>
+              </w:rPr>
+              <w:t xml:space="preserve"> Cumplido (</w:t>
             </w:r>
             <w:proofErr w:type="spellStart"/>
             <w:r>
@@ -932,7 +978,7 @@
               <w:rPr>
                 <w:rFonts w:cs="Calibri"/>
               </w:rPr>
-              <w:t xml:space="preserve"> y adaptadores, PR #7 a #11; DAS v1.0.2; catálogo RNF v1.0.1).</w:t>
+              <w:t xml:space="preserve"> y adaptadores, PR #7 a #11; DAS v1.0.2; catálogo RNF v1.0.2).</w:t>
             </w:r>
           </w:p>
           <w:p>
@@ -943,7 +989,19 @@
               <w:rPr>
                 <w:rFonts w:cs="Calibri"/>
               </w:rPr>
-              <w:t>3. Implementar la integración con Webpay como MVP funcional dentro de D-PAY — Parcial: aprobado y rechazado PASS (04/10, HU-06); TC-063 parcial; TC-064 / TC-RG-01 Parcial (13/10/2026, Kozen P8 Neo, Diego Madrid); evidencia en Sprint_03/capturas_20261013/; DTE pendiente.</w:t>
+              <w:t xml:space="preserve">3. Implementar la integración con Webpay como MVP funcional dentro de D-PAY </w:t>
+            </w:r>
+            <w:r>
+              <w:rPr>
+                <w:rFonts w:cs="Calibri"/>
+              </w:rPr>
+              <w:t>-</w:t>
+            </w:r>
+            <w:r>
+              <w:rPr>
+                <w:rFonts w:cs="Calibri"/>
+              </w:rPr>
+              <w:t xml:space="preserve"> Parcial: aprobado y rechazado PASS (04/10, HU-06); TC-063 parcial; TC-064 / TC-RG-01 Parcial (13/10/2026, Kozen P8 Neo, Diego Madrid); evidencia en Sprint_03/capturas_20261013/; DTE pendiente.</w:t>
             </w:r>
           </w:p>
           <w:p>
@@ -954,7 +1012,19 @@
               <w:rPr>
                 <w:rFonts w:cs="Calibri"/>
               </w:rPr>
-              <w:t>4. Documentar en el Product Backlog las integraciones futuras con Flow, Mercado Pago y PayPal — Cumplido (Product Backlog de la Fase 1).</w:t>
+              <w:t xml:space="preserve">4. Documentar en el Product Backlog las integraciones futuras con Flow, Mercado Pago y PayPal </w:t>
+            </w:r>
+            <w:r>
+              <w:rPr>
+                <w:rFonts w:cs="Calibri"/>
+              </w:rPr>
+              <w:t>-</w:t>
+            </w:r>
+            <w:r>
+              <w:rPr>
+                <w:rFonts w:cs="Calibri"/>
+              </w:rPr>
+              <w:t xml:space="preserve"> Cumplido (Product Backlog de la Fase 1).</w:t>
             </w:r>
           </w:p>
           <w:p>
@@ -979,7 +1049,19 @@
               <w:rPr>
                 <w:rFonts w:cs="Calibri"/>
               </w:rPr>
-              <w:t>, backlog priorizado y ceremonias — En curso: actas S01 y S02 firmadas; Sprint 3 en curso. Git a cargo de Pablo Gutiérrez y Diego Madrid (PR #17).</w:t>
+              <w:t xml:space="preserve">, backlog priorizado y ceremonias </w:t>
+            </w:r>
+            <w:r>
+              <w:rPr>
+                <w:rFonts w:cs="Calibri"/>
+              </w:rPr>
+              <w:t>-</w:t>
+            </w:r>
+            <w:r>
+              <w:rPr>
+                <w:rFonts w:cs="Calibri"/>
+              </w:rPr>
+              <w:t xml:space="preserve"> Actas S01, S02 y S03 firmadas; retrospectiva S03 cerrada 15/10/2026 (Goal Parcial). Git a cargo de Pablo Gutiérrez y Diego Madrid (PR #17).</w:t>
             </w:r>
           </w:p>
         </w:tc>
@@ -1013,13 +1095,7 @@
           </w:tcPr>
           <w:p>
             <w:pPr>
-              <w:pStyle w:val="Prrafodelista"/>
-              <w:numPr>
-                <w:ilvl w:val="0"/>
-                <w:numId w:val="1"/>
-              </w:numPr>
               <w:spacing w:after="120"/>
-              <w:ind w:left="318" w:hanging="284"/>
               <w:jc w:val="both"/>
               <w:rPr>
                 <w:rFonts w:cs="Arial"/>
@@ -1034,7 +1110,19 @@
               <w:rPr>
                 <w:rFonts w:cs="Calibri"/>
               </w:rPr>
-              <w:t xml:space="preserve">Metodología utilizada. Scrum con siete </w:t>
+              <w:t>Metodología utilizada</w:t>
+            </w:r>
+            <w:r>
+              <w:rPr>
+                <w:rFonts w:cs="Calibri"/>
+              </w:rPr>
+              <w:t>;</w:t>
+            </w:r>
+            <w:r>
+              <w:rPr>
+                <w:rFonts w:cs="Calibri"/>
+              </w:rPr>
+              <w:t xml:space="preserve"> Scrum con siete </w:t>
             </w:r>
             <w:proofErr w:type="spellStart"/>
             <w:r>
@@ -1048,22 +1136,16 @@
               <w:rPr>
                 <w:rFonts w:cs="Calibri"/>
               </w:rPr>
-              <w:t xml:space="preserve"> de dos semanas agrupados en tres fases académicas (Schwaber y Sutherland, 2020). José Robles Rocha (Dtemite) es el Product Owner, Pablo Gutiérrez el Scrum Master y el equipo de desarrollo lo forman Diego Madrid, Pablo Gutiérrez y Reinhartd Munzenmayer. Cada sprint tiene un objetivo y cierra con una retrospectiva </w:t>
-            </w:r>
-            <w:proofErr w:type="spellStart"/>
-            <w:r>
-              <w:rPr>
-                <w:rFonts w:cs="Calibri"/>
-              </w:rPr>
-              <w:t>Start</w:t>
-            </w:r>
-            <w:proofErr w:type="spellEnd"/>
-            <w:r>
-              <w:rPr>
-                <w:rFonts w:cs="Calibri"/>
-              </w:rPr>
-              <w:t xml:space="preserve"> / Stop / Continue cuyas acciones quedan con responsable y sprint de destino.</w:t>
-            </w:r>
+              <w:t xml:space="preserve"> de dos semanas agrupados en tres fases académicas (Schwaber y Sutherland, 2020). José Robles Rocha (Dtemite) es el Product Owner, Pablo Gutiérrez el Scrum Master y el equipo de desarrollo lo forman Diego Madrid, Pablo Gutiérrez y Reinhartd Munzenmayer. Cada sprint tiene un objetivo y cierra con una retrospectiva Start / Stop / Continue cuyas acciones quedan con responsable y sprint de destino.</w:t>
+            </w:r>
+          </w:p>
+          <w:p>
+            <w:pPr>
+              <w:spacing w:after="120"/>
+              <w:rPr>
+                <w:rFonts w:cs="Calibri"/>
+              </w:rPr>
+            </w:pPr>
           </w:p>
           <w:p>
             <w:pPr>
@@ -1163,13 +1245,7 @@
           </w:tcPr>
           <w:p>
             <w:pPr>
-              <w:pStyle w:val="Prrafodelista"/>
-              <w:numPr>
-                <w:ilvl w:val="0"/>
-                <w:numId w:val="1"/>
-              </w:numPr>
               <w:spacing w:after="120"/>
-              <w:ind w:left="318" w:hanging="284"/>
               <w:jc w:val="both"/>
               <w:rPr>
                 <w:rFonts w:cs="Arial"/>
@@ -1184,7 +1260,19 @@
               <w:rPr>
                 <w:rFonts w:cs="Calibri"/>
               </w:rPr>
-              <w:t xml:space="preserve">Etapas o actividades. Sprint 1 (08/09–21/09/2026): base </w:t>
+              <w:t>Etapas</w:t>
+            </w:r>
+            <w:r>
+              <w:rPr>
+                <w:rFonts w:cs="Calibri"/>
+              </w:rPr>
+              <w:t xml:space="preserve">; </w:t>
+            </w:r>
+            <w:r>
+              <w:rPr>
+                <w:rFonts w:cs="Calibri"/>
+              </w:rPr>
+              <w:t xml:space="preserve">Sprint 1 (08/09–21/09/2026): base </w:t>
             </w:r>
             <w:proofErr w:type="spellStart"/>
             <w:r>
@@ -1226,7 +1314,7 @@
               <w:rPr>
                 <w:rFonts w:cs="Calibri"/>
               </w:rPr>
-              <w:t xml:space="preserve"> y efectivo operativos (19/09); PR #7 a #11. Sprint 2 (22/09–05/10/2026): cerrar Webpay (rechazo y cancelación), efectivo e inicio de emisión DTE. Parcial: QR y cancelación (03/10), comprobante POS y rechazo (04/10) PASS; DTE no cerrado; PR #12 a #15. Sprint 3 (06/10–17/10/2026): cerrar DTE, historial y nota de crédito; este informe. En curso al 12/10: Jest 17/17; DTE, </w:t>
+              <w:t xml:space="preserve"> y efectivo operativos (19/09); PR #7 a #11. Sprint 2 (22/09–05/10/2026): cerrar Webpay (rechazo y cancelación), efectivo e inicio de emisión DTE. Parcial: QR y cancelación (03/10), comprobante POS y rechazo (04/10) PASS; DTE no cerrado; PR #12 a #15. Sprint 3 (06/10–17/10/2026): cerrar DTE, historial y nota de crédito; este informe. Al corte 18/10/2026: Jest 17/17; DTE, </w:t>
             </w:r>
             <w:proofErr w:type="spellStart"/>
             <w:r>
@@ -1298,6 +1386,22 @@
           <w:p>
             <w:pPr>
               <w:spacing w:after="120"/>
+              <w:rPr>
+                <w:rFonts w:cs="Calibri"/>
+              </w:rPr>
+            </w:pPr>
+          </w:p>
+          <w:p>
+            <w:pPr>
+              <w:spacing w:after="120"/>
+              <w:rPr>
+                <w:rFonts w:cs="Calibri"/>
+              </w:rPr>
+            </w:pPr>
+          </w:p>
+          <w:p>
+            <w:pPr>
+              <w:spacing w:after="120"/>
             </w:pPr>
             <w:r>
               <w:rPr>
@@ -1395,7 +1499,7 @@
               <w:rPr>
                 <w:rFonts w:cs="Calibri"/>
               </w:rPr>
-              <w:t xml:space="preserve"> que apunta al proxy, porque Transbank no entrega un QR nativo. Emisión de DTE movida del Sprint 2 al Sprint 3. Regresión TUU/Kozen cubierta con 17 pruebas unitarias mientras TC-064 sigue bloqueado, en espera de Diego Madrid (TUU/Kozen en producción). Renombre de evidencias del 11/10. </w:t>
+              <w:t xml:space="preserve"> que apunta al proxy, porque Transbank no entrega un QR nativo. Emisión de DTE movida del Sprint 2 al Sprint 3. Regresión TUU/Kozen cubierta con 17 pruebas unitarias con TC-064 / TC-RG-01 Parcial (13/10/2026, Kozen P8 Neo, Diego Madrid) (TUU/Kozen en producción). Renombre de evidencias del 11/10. </w:t>
             </w:r>
             <w:proofErr w:type="spellStart"/>
             <w:r>
@@ -1460,13 +1564,7 @@
           </w:tcPr>
           <w:p>
             <w:pPr>
-              <w:pStyle w:val="Prrafodelista"/>
-              <w:numPr>
-                <w:ilvl w:val="0"/>
-                <w:numId w:val="1"/>
-              </w:numPr>
               <w:spacing w:after="120"/>
-              <w:ind w:left="314" w:hanging="284"/>
               <w:jc w:val="both"/>
               <w:rPr>
                 <w:rFonts w:cs="Arial"/>
@@ -1504,7 +1602,7 @@
               <w:rPr>
                 <w:rFonts w:cs="Calibri"/>
               </w:rPr>
-              <w:t>Diseño: DAS v1.0.2, ADR-002 (Madrid, 2026) y catálogo RNF v1.0.1 (Munzenmayer, 2026a) en 05_Documento_de_Diseno.</w:t>
+              <w:t>Diseño: DAS v1.0.2, ADR-002 (Madrid, 2026) y catálogo RNF v1.0.2 (Munzenmayer, 2026a) en 05_Documento_de_Diseno.</w:t>
             </w:r>
           </w:p>
           <w:p>
@@ -1607,7 +1705,7 @@
               <w:rPr>
                 <w:rFonts w:cs="Calibri"/>
               </w:rPr>
-              <w:t>Pruebas: Plan v1.2, catálogo CSY4111 (15 OK, 2 parciales MTC-12 y MTC-13, 1 NOK, 1 bloqueado de 19), Listado de Defectos v1.2 (Munzenmayer, 2026b, 2026c), Jest 17/17. HU-06: Webpay aprobado y rechazado PASS; TC-063 parcial; TC-064 / TC-RG-01 Parcial (13/10, Kozen). Figuras 1 a 5 y salida Jest (Figura 6) en el Anexo.</w:t>
+              <w:t>Pruebas: Plan v1.2, catálogo CSY4111 (15 OK, 2 parciales MTC-12 y MTC-13, 1 NOK, 0 bloqueados de 19 (TC-064 Parcial fuera del conteo 15 MTC)), Listado de Defectos v1.2 (Munzenmayer, 2026b, 2026c), Jest 17/17. HU-06: Webpay aprobado y rechazado PASS; TC-063 parcial; TC-064 / TC-RG-01 Parcial (13/10, Kozen). Figuras 1 a 5 y salida Jest (Figura 6) en el Anexo.</w:t>
             </w:r>
           </w:p>
           <w:p>
@@ -1618,7 +1716,7 @@
               <w:rPr>
                 <w:rFonts w:cs="Calibri"/>
               </w:rPr>
-              <w:t>Gestión: actas S01 y S02 firmadas; Retro S03 v0.2. No hay exposición oral ni video demostrativo en esta entrega.</w:t>
+              <w:t>Gestión: actas S01, S02 y S03 firmadas; Retro S03 v0.5. No hay exposición oral ni video demostrativo en esta entrega.</w:t>
             </w:r>
           </w:p>
           <w:p>
@@ -1714,34 +1812,6 @@
           </w:tcPr>
           <w:p>
             <w:pPr>
-              <w:pStyle w:val="Prrafodelista"/>
-              <w:numPr>
-                <w:ilvl w:val="0"/>
-                <w:numId w:val="1"/>
-              </w:numPr>
-              <w:spacing w:after="120"/>
-              <w:ind w:left="314" w:hanging="284"/>
-              <w:jc w:val="both"/>
-              <w:rPr>
-                <w:rFonts w:cs="Arial"/>
-                <w:i/>
-                <w:iCs/>
-                <w:color w:val="0070C0"/>
-                <w:sz w:val="18"/>
-                <w:szCs w:val="18"/>
-                <w:lang w:eastAsia="es-CL"/>
-              </w:rPr>
-            </w:pPr>
-            <w:r>
-              <w:rPr>
-                <w:rFonts w:cs="Calibri"/>
-                <w:i/>
-              </w:rPr>
-              <w:t>Este apartado es individual. Cada integrante redacta su propia reflexión. No se escriben en nombre de Diego Madrid ni de Pablo Gutiérrez.</w:t>
-            </w:r>
-          </w:p>
-          <w:p>
-            <w:pPr>
               <w:spacing w:after="120"/>
             </w:pPr>
             <w:r>
@@ -1801,8 +1871,41 @@
               <w:rPr>
                 <w:rFonts w:cs="Calibri"/>
               </w:rPr>
-              <w:t>, programando y utilizando IA. Ese rumbo se mantiene; quiero profundizar en calidad de software aplicada a pagos (trazabilidad, evidencia auditable y requisitos no funcionales medibles), que es el trabajo que efectivamente hice en HU-06 y en los documentos 06 y 07.</w:t>
-            </w:r>
+              <w:t>, programando y utilizando IA. Ese rumbo se mantiene; quiero profundizar en calidad de software aplicada a pagos (trazabilidad, evidencia auditable y requisitos no funcionales medibles.</w:t>
+            </w:r>
+          </w:p>
+          <w:p>
+            <w:pPr>
+              <w:spacing w:after="120"/>
+              <w:rPr>
+                <w:rFonts w:cs="Calibri"/>
+                <w:b/>
+                <w:color w:val="1F3864"/>
+                <w:sz w:val="24"/>
+              </w:rPr>
+            </w:pPr>
+          </w:p>
+          <w:p>
+            <w:pPr>
+              <w:spacing w:after="120"/>
+              <w:rPr>
+                <w:rFonts w:cs="Calibri"/>
+                <w:b/>
+                <w:color w:val="1F3864"/>
+                <w:sz w:val="24"/>
+              </w:rPr>
+            </w:pPr>
+          </w:p>
+          <w:p>
+            <w:pPr>
+              <w:spacing w:after="120"/>
+              <w:rPr>
+                <w:rFonts w:cs="Calibri"/>
+                <w:b/>
+                <w:color w:val="1F3864"/>
+                <w:sz w:val="24"/>
+              </w:rPr>
+            </w:pPr>
           </w:p>
           <w:p>
             <w:pPr>
@@ -1918,39 +2021,47 @@
     <w:p/>
     <w:p>
       <w:pPr>
-        <w:spacing w:before="280"/>
-      </w:pPr>
-      <w:r>
+        <w:spacing w:after="0" w:line="240" w:lineRule="auto"/>
         <w:rPr>
           <w:rFonts w:cs="Calibri"/>
           <w:b/>
           <w:color w:val="1F3864"/>
           <w:sz w:val="28"/>
         </w:rPr>
-        <w:t>Referencias</w:t>
+      </w:pPr>
+      <w:r>
+        <w:rPr>
+          <w:rFonts w:cs="Calibri"/>
+          <w:b/>
+          <w:color w:val="1F3864"/>
+          <w:sz w:val="28"/>
+        </w:rPr>
+        <w:br w:type="page"/>
       </w:r>
     </w:p>
     <w:p>
       <w:pPr>
-        <w:spacing w:after="120"/>
-      </w:pPr>
-      <w:r>
-        <w:rPr>
-          <w:rFonts w:cs="Calibri"/>
-        </w:rPr>
-        <w:t>Las citas en el texto siguen APA 7. Solo se listan fuentes usadas en este instrumento.</w:t>
+        <w:spacing w:before="280"/>
+      </w:pPr>
+      <w:r>
+        <w:rPr>
+          <w:rFonts w:cs="Calibri"/>
+          <w:b/>
+          <w:color w:val="1F3864"/>
+          <w:sz w:val="28"/>
+        </w:rPr>
+        <w:t>Referencias</w:t>
       </w:r>
     </w:p>
     <w:p>
       <w:pPr>
         <w:spacing w:after="120"/>
-        <w:ind w:left="720" w:hanging="720"/>
-      </w:pPr>
-      <w:r>
-        <w:rPr>
-          <w:rFonts w:cs="Calibri"/>
-        </w:rPr>
-        <w:t>Duoc UC. (2026b). 2.6 Guía del estudiante Fase 2: Informe final Proyecto APT [Guía de asignatura]. Escuela de Informática y Telecomunicaciones.</w:t>
+      </w:pPr>
+      <w:r>
+        <w:rPr>
+          <w:rFonts w:cs="Calibri"/>
+        </w:rPr>
+        <w:t>Las citas en el texto siguen APA 7. Solo se listan fuentes usadas en este instrumento.</w:t>
       </w:r>
     </w:p>
     <w:p>
@@ -1962,7 +2073,7 @@
         <w:rPr>
           <w:rFonts w:cs="Calibri"/>
         </w:rPr>
-        <w:t>Equipo D-PAY 3.0. (2026a). Acta de retrospectiva Sprint 1 [Documento interno firmado, 04/10/2026]. Duoc UC; Dtemite.</w:t>
+        <w:t>Duoc UC. (2026b). 2.6 Guía del estudiante Fase 2: Informe final Proyecto APT [Guía de asignatura]. Escuela de Informática y Telecomunicaciones.</w:t>
       </w:r>
     </w:p>
     <w:p>
@@ -1974,7 +2085,7 @@
         <w:rPr>
           <w:rFonts w:cs="Calibri"/>
         </w:rPr>
-        <w:t>Equipo D-PAY 3.0. (2026b). Acta de retrospectiva Sprint 2 [Documento interno firmado, 04/10/2026]. Duoc UC; Dtemite.</w:t>
+        <w:t>Equipo D-PAY 3.0. (2026a). Acta de retrospectiva Sprint 1 [Documento interno firmado, 04/10/2026]. Duoc UC; Dtemite.</w:t>
       </w:r>
     </w:p>
     <w:p>
@@ -1986,7 +2097,7 @@
         <w:rPr>
           <w:rFonts w:cs="Calibri"/>
         </w:rPr>
-        <w:t>Equipo D-PAY 3.0. (2026d). Informe de avance Fase 2 D-PAY 3.0 [Informe formativo 2.3]. Duoc UC.</w:t>
+        <w:t>Equipo D-PAY 3.0. (2026b). Acta de retrospectiva Sprint 2 [Documento interno firmado, 04/10/2026]. Duoc UC; Dtemite.</w:t>
       </w:r>
     </w:p>
     <w:p>
@@ -1998,21 +2109,7 @@
         <w:rPr>
           <w:rFonts w:cs="Calibri"/>
         </w:rPr>
-        <w:t xml:space="preserve">Equipo D-PAY 3.0. (2026c). Informe de proyecto Fase 1: D-PAY 3.0, evolución hacia una arquitectura de pagos </w:t>
-      </w:r>
-      <w:proofErr w:type="spellStart"/>
-      <w:r>
-        <w:rPr>
-          <w:rFonts w:cs="Calibri"/>
-        </w:rPr>
-        <w:t>multi-gateway</w:t>
-      </w:r>
-      <w:proofErr w:type="spellEnd"/>
-      <w:r>
-        <w:rPr>
-          <w:rFonts w:cs="Calibri"/>
-        </w:rPr>
-        <w:t xml:space="preserve"> [Informe formativo 1.4]. Duoc UC.</w:t>
+        <w:t>Equipo D-PAY 3.0. (2026d). Informe de avance Fase 2 D-PAY 3.0 [Informe formativo 2.3]. Duoc UC.</w:t>
       </w:r>
     </w:p>
     <w:p>
@@ -2024,7 +2121,21 @@
         <w:rPr>
           <w:rFonts w:cs="Calibri"/>
         </w:rPr>
-        <w:t>Gutiérrez, P. (2026). Diario de reflexión Fase 1 [Instrumento 1.2]. Duoc UC.</w:t>
+        <w:t xml:space="preserve">Equipo D-PAY 3.0. (2026c). Informe de proyecto Fase 1: D-PAY 3.0, evolución hacia una arquitectura de pagos </w:t>
+      </w:r>
+      <w:proofErr w:type="spellStart"/>
+      <w:r>
+        <w:rPr>
+          <w:rFonts w:cs="Calibri"/>
+        </w:rPr>
+        <w:t>multi-gateway</w:t>
+      </w:r>
+      <w:proofErr w:type="spellEnd"/>
+      <w:r>
+        <w:rPr>
+          <w:rFonts w:cs="Calibri"/>
+        </w:rPr>
+        <w:t xml:space="preserve"> [Informe formativo 1.4]. Duoc UC.</w:t>
       </w:r>
     </w:p>
     <w:p>
@@ -2036,189 +2147,7 @@
         <w:rPr>
           <w:rFonts w:cs="Calibri"/>
         </w:rPr>
-        <w:t xml:space="preserve">International </w:t>
-      </w:r>
-      <w:proofErr w:type="spellStart"/>
-      <w:r>
-        <w:rPr>
-          <w:rFonts w:cs="Calibri"/>
-        </w:rPr>
-        <w:t>Organization</w:t>
-      </w:r>
-      <w:proofErr w:type="spellEnd"/>
-      <w:r>
-        <w:rPr>
-          <w:rFonts w:cs="Calibri"/>
-        </w:rPr>
-        <w:t xml:space="preserve"> </w:t>
-      </w:r>
-      <w:proofErr w:type="spellStart"/>
-      <w:r>
-        <w:rPr>
-          <w:rFonts w:cs="Calibri"/>
-        </w:rPr>
-        <w:t>for</w:t>
-      </w:r>
-      <w:proofErr w:type="spellEnd"/>
-      <w:r>
-        <w:rPr>
-          <w:rFonts w:cs="Calibri"/>
-        </w:rPr>
-        <w:t xml:space="preserve"> </w:t>
-      </w:r>
-      <w:proofErr w:type="spellStart"/>
-      <w:r>
-        <w:rPr>
-          <w:rFonts w:cs="Calibri"/>
-        </w:rPr>
-        <w:t>Standardization</w:t>
-      </w:r>
-      <w:proofErr w:type="spellEnd"/>
-      <w:r>
-        <w:rPr>
-          <w:rFonts w:cs="Calibri"/>
-        </w:rPr>
-        <w:t xml:space="preserve">. (2011). </w:t>
-      </w:r>
-      <w:proofErr w:type="spellStart"/>
-      <w:r>
-        <w:rPr>
-          <w:rFonts w:cs="Calibri"/>
-        </w:rPr>
-        <w:t>Systems</w:t>
-      </w:r>
-      <w:proofErr w:type="spellEnd"/>
-      <w:r>
-        <w:rPr>
-          <w:rFonts w:cs="Calibri"/>
-        </w:rPr>
-        <w:t xml:space="preserve"> and software </w:t>
-      </w:r>
-      <w:proofErr w:type="spellStart"/>
-      <w:r>
-        <w:rPr>
-          <w:rFonts w:cs="Calibri"/>
-        </w:rPr>
-        <w:t>engineering</w:t>
-      </w:r>
-      <w:proofErr w:type="spellEnd"/>
-      <w:r>
-        <w:rPr>
-          <w:rFonts w:cs="Calibri"/>
-        </w:rPr>
-        <w:t xml:space="preserve"> — </w:t>
-      </w:r>
-      <w:proofErr w:type="spellStart"/>
-      <w:r>
-        <w:rPr>
-          <w:rFonts w:cs="Calibri"/>
-        </w:rPr>
-        <w:t>Systems</w:t>
-      </w:r>
-      <w:proofErr w:type="spellEnd"/>
-      <w:r>
-        <w:rPr>
-          <w:rFonts w:cs="Calibri"/>
-        </w:rPr>
-        <w:t xml:space="preserve"> and software </w:t>
-      </w:r>
-      <w:proofErr w:type="spellStart"/>
-      <w:r>
-        <w:rPr>
-          <w:rFonts w:cs="Calibri"/>
-        </w:rPr>
-        <w:t>Quality</w:t>
-      </w:r>
-      <w:proofErr w:type="spellEnd"/>
-      <w:r>
-        <w:rPr>
-          <w:rFonts w:cs="Calibri"/>
-        </w:rPr>
-        <w:t xml:space="preserve"> </w:t>
-      </w:r>
-      <w:proofErr w:type="spellStart"/>
-      <w:r>
-        <w:rPr>
-          <w:rFonts w:cs="Calibri"/>
-        </w:rPr>
-        <w:t>Requirements</w:t>
-      </w:r>
-      <w:proofErr w:type="spellEnd"/>
-      <w:r>
-        <w:rPr>
-          <w:rFonts w:cs="Calibri"/>
-        </w:rPr>
-        <w:t xml:space="preserve"> and </w:t>
-      </w:r>
-      <w:proofErr w:type="spellStart"/>
-      <w:r>
-        <w:rPr>
-          <w:rFonts w:cs="Calibri"/>
-        </w:rPr>
-        <w:t>Evaluation</w:t>
-      </w:r>
-      <w:proofErr w:type="spellEnd"/>
-      <w:r>
-        <w:rPr>
-          <w:rFonts w:cs="Calibri"/>
-        </w:rPr>
-        <w:t xml:space="preserve"> (</w:t>
-      </w:r>
-      <w:proofErr w:type="spellStart"/>
-      <w:r>
-        <w:rPr>
-          <w:rFonts w:cs="Calibri"/>
-        </w:rPr>
-        <w:t>SQuaRE</w:t>
-      </w:r>
-      <w:proofErr w:type="spellEnd"/>
-      <w:r>
-        <w:rPr>
-          <w:rFonts w:cs="Calibri"/>
-        </w:rPr>
-        <w:t xml:space="preserve">) — </w:t>
-      </w:r>
-      <w:proofErr w:type="spellStart"/>
-      <w:r>
-        <w:rPr>
-          <w:rFonts w:cs="Calibri"/>
-        </w:rPr>
-        <w:t>System</w:t>
-      </w:r>
-      <w:proofErr w:type="spellEnd"/>
-      <w:r>
-        <w:rPr>
-          <w:rFonts w:cs="Calibri"/>
-        </w:rPr>
-        <w:t xml:space="preserve"> and software </w:t>
-      </w:r>
-      <w:proofErr w:type="spellStart"/>
-      <w:r>
-        <w:rPr>
-          <w:rFonts w:cs="Calibri"/>
-        </w:rPr>
-        <w:t>quality</w:t>
-      </w:r>
-      <w:proofErr w:type="spellEnd"/>
-      <w:r>
-        <w:rPr>
-          <w:rFonts w:cs="Calibri"/>
-        </w:rPr>
-        <w:t xml:space="preserve"> </w:t>
-      </w:r>
-      <w:proofErr w:type="spellStart"/>
-      <w:r>
-        <w:rPr>
-          <w:rFonts w:cs="Calibri"/>
-        </w:rPr>
-        <w:t>models</w:t>
-      </w:r>
-      <w:proofErr w:type="spellEnd"/>
-      <w:r>
-        <w:rPr>
-          <w:rFonts w:cs="Calibri"/>
-        </w:rPr>
-        <w:t xml:space="preserve"> (ISO/IEC 25010:2011). https://www.iso.org/standard/35733.html</w:t>
+        <w:t>Gutiérrez, P. (2026). Diario de reflexión Fase 1 [Instrumento 1.2]. Duoc UC.</w:t>
       </w:r>
     </w:p>
     <w:p>
@@ -2272,63 +2201,171 @@
         <w:rPr>
           <w:rFonts w:cs="Calibri"/>
         </w:rPr>
-        <w:t xml:space="preserve">. (2021). Software and </w:t>
+        <w:t xml:space="preserve">. (2011). </w:t>
       </w:r>
       <w:proofErr w:type="spellStart"/>
       <w:r>
         <w:rPr>
           <w:rFonts w:cs="Calibri"/>
         </w:rPr>
-        <w:t>systems</w:t>
+        <w:t>Systems</w:t>
       </w:r>
       <w:proofErr w:type="spellEnd"/>
       <w:r>
         <w:rPr>
           <w:rFonts w:cs="Calibri"/>
         </w:rPr>
+        <w:t xml:space="preserve"> and software </w:t>
+      </w:r>
+      <w:proofErr w:type="spellStart"/>
+      <w:r>
+        <w:rPr>
+          <w:rFonts w:cs="Calibri"/>
+        </w:rPr>
+        <w:t>engineering</w:t>
+      </w:r>
+      <w:proofErr w:type="spellEnd"/>
+      <w:r>
+        <w:rPr>
+          <w:rFonts w:cs="Calibri"/>
+        </w:rPr>
         <w:t xml:space="preserve"> </w:t>
       </w:r>
+      <w:r>
+        <w:rPr>
+          <w:rFonts w:cs="Calibri"/>
+        </w:rPr>
+        <w:t>-</w:t>
+      </w:r>
+      <w:r>
+        <w:rPr>
+          <w:rFonts w:cs="Calibri"/>
+        </w:rPr>
+        <w:t xml:space="preserve"> </w:t>
+      </w:r>
       <w:proofErr w:type="spellStart"/>
       <w:r>
         <w:rPr>
           <w:rFonts w:cs="Calibri"/>
         </w:rPr>
-        <w:t>engineering</w:t>
+        <w:t>Systems</w:t>
       </w:r>
       <w:proofErr w:type="spellEnd"/>
       <w:r>
         <w:rPr>
           <w:rFonts w:cs="Calibri"/>
         </w:rPr>
-        <w:t xml:space="preserve"> — Software </w:t>
+        <w:t xml:space="preserve"> and software </w:t>
       </w:r>
       <w:proofErr w:type="spellStart"/>
       <w:r>
         <w:rPr>
           <w:rFonts w:cs="Calibri"/>
         </w:rPr>
-        <w:t>testing</w:t>
+        <w:t>Quality</w:t>
       </w:r>
       <w:proofErr w:type="spellEnd"/>
       <w:r>
         <w:rPr>
           <w:rFonts w:cs="Calibri"/>
         </w:rPr>
-        <w:t xml:space="preserve"> — Part 3: Test </w:t>
+        <w:t xml:space="preserve"> </w:t>
       </w:r>
       <w:proofErr w:type="spellStart"/>
       <w:r>
         <w:rPr>
           <w:rFonts w:cs="Calibri"/>
         </w:rPr>
-        <w:t>documentation</w:t>
+        <w:t>Requirements</w:t>
       </w:r>
       <w:proofErr w:type="spellEnd"/>
       <w:r>
         <w:rPr>
           <w:rFonts w:cs="Calibri"/>
         </w:rPr>
-        <w:t xml:space="preserve"> (ISO/IEC/IEEE 29119-3:2021). https://www.iso.org/standard/79429.html</w:t>
+        <w:t xml:space="preserve"> and </w:t>
+      </w:r>
+      <w:proofErr w:type="spellStart"/>
+      <w:r>
+        <w:rPr>
+          <w:rFonts w:cs="Calibri"/>
+        </w:rPr>
+        <w:t>Evaluation</w:t>
+      </w:r>
+      <w:proofErr w:type="spellEnd"/>
+      <w:r>
+        <w:rPr>
+          <w:rFonts w:cs="Calibri"/>
+        </w:rPr>
+        <w:t xml:space="preserve"> (</w:t>
+      </w:r>
+      <w:proofErr w:type="spellStart"/>
+      <w:r>
+        <w:rPr>
+          <w:rFonts w:cs="Calibri"/>
+        </w:rPr>
+        <w:t>SQuaRE</w:t>
+      </w:r>
+      <w:proofErr w:type="spellEnd"/>
+      <w:r>
+        <w:rPr>
+          <w:rFonts w:cs="Calibri"/>
+        </w:rPr>
+        <w:t xml:space="preserve">) </w:t>
+      </w:r>
+      <w:r>
+        <w:rPr>
+          <w:rFonts w:cs="Calibri"/>
+        </w:rPr>
+        <w:t>-</w:t>
+      </w:r>
+      <w:r>
+        <w:rPr>
+          <w:rFonts w:cs="Calibri"/>
+        </w:rPr>
+        <w:t xml:space="preserve"> </w:t>
+      </w:r>
+      <w:proofErr w:type="spellStart"/>
+      <w:r>
+        <w:rPr>
+          <w:rFonts w:cs="Calibri"/>
+        </w:rPr>
+        <w:t>System</w:t>
+      </w:r>
+      <w:proofErr w:type="spellEnd"/>
+      <w:r>
+        <w:rPr>
+          <w:rFonts w:cs="Calibri"/>
+        </w:rPr>
+        <w:t xml:space="preserve"> and software </w:t>
+      </w:r>
+      <w:proofErr w:type="spellStart"/>
+      <w:r>
+        <w:rPr>
+          <w:rFonts w:cs="Calibri"/>
+        </w:rPr>
+        <w:t>quality</w:t>
+      </w:r>
+      <w:proofErr w:type="spellEnd"/>
+      <w:r>
+        <w:rPr>
+          <w:rFonts w:cs="Calibri"/>
+        </w:rPr>
+        <w:t xml:space="preserve"> </w:t>
+      </w:r>
+      <w:proofErr w:type="spellStart"/>
+      <w:r>
+        <w:rPr>
+          <w:rFonts w:cs="Calibri"/>
+        </w:rPr>
+        <w:t>models</w:t>
+      </w:r>
+      <w:proofErr w:type="spellEnd"/>
+      <w:r>
+        <w:rPr>
+          <w:rFonts w:cs="Calibri"/>
+        </w:rPr>
+        <w:t xml:space="preserve"> (ISO/IEC 25010:2011). https://www.iso.org/standard/35733.html</w:t>
       </w:r>
     </w:p>
     <w:p>
@@ -2340,7 +2377,129 @@
         <w:rPr>
           <w:rFonts w:cs="Calibri"/>
         </w:rPr>
-        <w:t>Madrid, D. (2026). Documento de Arquitectura del Sistema D-PAY 3.0 (Versión 1.0.2) [Documento interno]. Dtemite.</w:t>
+        <w:t xml:space="preserve">International </w:t>
+      </w:r>
+      <w:proofErr w:type="spellStart"/>
+      <w:r>
+        <w:rPr>
+          <w:rFonts w:cs="Calibri"/>
+        </w:rPr>
+        <w:t>Organization</w:t>
+      </w:r>
+      <w:proofErr w:type="spellEnd"/>
+      <w:r>
+        <w:rPr>
+          <w:rFonts w:cs="Calibri"/>
+        </w:rPr>
+        <w:t xml:space="preserve"> </w:t>
+      </w:r>
+      <w:proofErr w:type="spellStart"/>
+      <w:r>
+        <w:rPr>
+          <w:rFonts w:cs="Calibri"/>
+        </w:rPr>
+        <w:t>for</w:t>
+      </w:r>
+      <w:proofErr w:type="spellEnd"/>
+      <w:r>
+        <w:rPr>
+          <w:rFonts w:cs="Calibri"/>
+        </w:rPr>
+        <w:t xml:space="preserve"> </w:t>
+      </w:r>
+      <w:proofErr w:type="spellStart"/>
+      <w:r>
+        <w:rPr>
+          <w:rFonts w:cs="Calibri"/>
+        </w:rPr>
+        <w:t>Standardization</w:t>
+      </w:r>
+      <w:proofErr w:type="spellEnd"/>
+      <w:r>
+        <w:rPr>
+          <w:rFonts w:cs="Calibri"/>
+        </w:rPr>
+        <w:t xml:space="preserve">. (2021). Software and </w:t>
+      </w:r>
+      <w:proofErr w:type="spellStart"/>
+      <w:r>
+        <w:rPr>
+          <w:rFonts w:cs="Calibri"/>
+        </w:rPr>
+        <w:t>systems</w:t>
+      </w:r>
+      <w:proofErr w:type="spellEnd"/>
+      <w:r>
+        <w:rPr>
+          <w:rFonts w:cs="Calibri"/>
+        </w:rPr>
+        <w:t xml:space="preserve"> </w:t>
+      </w:r>
+      <w:proofErr w:type="spellStart"/>
+      <w:r>
+        <w:rPr>
+          <w:rFonts w:cs="Calibri"/>
+        </w:rPr>
+        <w:t>engineering</w:t>
+      </w:r>
+      <w:proofErr w:type="spellEnd"/>
+      <w:r>
+        <w:rPr>
+          <w:rFonts w:cs="Calibri"/>
+        </w:rPr>
+        <w:t xml:space="preserve"> </w:t>
+      </w:r>
+      <w:r>
+        <w:rPr>
+          <w:rFonts w:cs="Calibri"/>
+        </w:rPr>
+        <w:t>-</w:t>
+      </w:r>
+      <w:r>
+        <w:rPr>
+          <w:rFonts w:cs="Calibri"/>
+        </w:rPr>
+        <w:t xml:space="preserve"> Software </w:t>
+      </w:r>
+      <w:proofErr w:type="spellStart"/>
+      <w:r>
+        <w:rPr>
+          <w:rFonts w:cs="Calibri"/>
+        </w:rPr>
+        <w:t>testing</w:t>
+      </w:r>
+      <w:proofErr w:type="spellEnd"/>
+      <w:r>
+        <w:rPr>
+          <w:rFonts w:cs="Calibri"/>
+        </w:rPr>
+        <w:t xml:space="preserve"> </w:t>
+      </w:r>
+      <w:r>
+        <w:rPr>
+          <w:rFonts w:cs="Calibri"/>
+        </w:rPr>
+        <w:t>-</w:t>
+      </w:r>
+      <w:r>
+        <w:rPr>
+          <w:rFonts w:cs="Calibri"/>
+        </w:rPr>
+        <w:t xml:space="preserve"> Part 3: Test </w:t>
+      </w:r>
+      <w:proofErr w:type="spellStart"/>
+      <w:r>
+        <w:rPr>
+          <w:rFonts w:cs="Calibri"/>
+        </w:rPr>
+        <w:t>documentation</w:t>
+      </w:r>
+      <w:proofErr w:type="spellEnd"/>
+      <w:r>
+        <w:rPr>
+          <w:rFonts w:cs="Calibri"/>
+        </w:rPr>
+        <w:t xml:space="preserve"> (ISO/IEC/IEEE 29119-3:2021). https://www.iso.org/standard/79429.html</w:t>
       </w:r>
     </w:p>
     <w:p>
@@ -2352,7 +2511,7 @@
         <w:rPr>
           <w:rFonts w:cs="Calibri"/>
         </w:rPr>
-        <w:t>Madrid, D. (2026). Diario de reflexión Fase 1 [Instrumento 1.2]. Duoc UC. (Además del DAS v1.0.2 citado más abajo.)</w:t>
+        <w:t>Madrid, D. (2026). Documento de Arquitectura del Sistema D-PAY 3.0 (Versión 1.0.2) [Documento interno]. Dtemite.</w:t>
       </w:r>
     </w:p>
     <w:p>
@@ -2364,7 +2523,7 @@
         <w:rPr>
           <w:rFonts w:cs="Calibri"/>
         </w:rPr>
-        <w:t>Munzenmayer, R. (2026a). Catálogo de requisitos no funcionales ISO/IEC 25010 D-PAY 3.0 (Versión 1.0.1) [Documento interno]. Duoc UC.</w:t>
+        <w:t>Madrid, D. (2026). Diario de reflexión Fase 1 [Instrumento 1.2]. Duoc UC. (Además del DAS v1.0.2 citado más abajo.)</w:t>
       </w:r>
     </w:p>
     <w:p>
@@ -2376,7 +2535,7 @@
         <w:rPr>
           <w:rFonts w:cs="Calibri"/>
         </w:rPr>
-        <w:t>Munzenmayer, R. (2026d). Diario de reflexión Fase 1 [Instrumento 1.2]. Duoc UC.</w:t>
+        <w:t>Munzenmayer, R. (2026a). Catálogo de requisitos no funcionales ISO/IEC 25010 D-PAY 3.0 (Versión 1.0.2) [Documento interno]. Duoc UC.</w:t>
       </w:r>
     </w:p>
     <w:p>
@@ -2388,7 +2547,7 @@
         <w:rPr>
           <w:rFonts w:cs="Calibri"/>
         </w:rPr>
-        <w:t>Munzenmayer, R. (2026b). Listado de defectos D-PAY 3.0 (Versión 1.2) [Documento interno]. Duoc UC.</w:t>
+        <w:t>Munzenmayer, R. (2026d). Diario de reflexión Fase 1 [Instrumento 1.2]. Duoc UC.</w:t>
       </w:r>
     </w:p>
     <w:p>
@@ -2400,7 +2559,7 @@
         <w:rPr>
           <w:rFonts w:cs="Calibri"/>
         </w:rPr>
-        <w:t>Munzenmayer, R. (2026c). Plan de pruebas D-PAY 3.0 (Versión 1.2) [Documento interno]. Duoc UC.</w:t>
+        <w:t>Munzenmayer, R. (2026b). Listado de defectos D-PAY 3.0 (Versión 1.2) [Documento interno]. Duoc UC.</w:t>
       </w:r>
     </w:p>
     <w:p>
@@ -2412,77 +2571,7 @@
         <w:rPr>
           <w:rFonts w:cs="Calibri"/>
         </w:rPr>
-        <w:t xml:space="preserve">PCI Security </w:t>
-      </w:r>
-      <w:proofErr w:type="spellStart"/>
-      <w:r>
-        <w:rPr>
-          <w:rFonts w:cs="Calibri"/>
-        </w:rPr>
-        <w:t>Standards</w:t>
-      </w:r>
-      <w:proofErr w:type="spellEnd"/>
-      <w:r>
-        <w:rPr>
-          <w:rFonts w:cs="Calibri"/>
-        </w:rPr>
-        <w:t xml:space="preserve"> Council. (2022). Payment Card </w:t>
-      </w:r>
-      <w:proofErr w:type="spellStart"/>
-      <w:r>
-        <w:rPr>
-          <w:rFonts w:cs="Calibri"/>
-        </w:rPr>
-        <w:t>Industry</w:t>
-      </w:r>
-      <w:proofErr w:type="spellEnd"/>
-      <w:r>
-        <w:rPr>
-          <w:rFonts w:cs="Calibri"/>
-        </w:rPr>
-        <w:t xml:space="preserve"> Data Security Standard: </w:t>
-      </w:r>
-      <w:proofErr w:type="spellStart"/>
-      <w:r>
-        <w:rPr>
-          <w:rFonts w:cs="Calibri"/>
-        </w:rPr>
-        <w:t>Requirements</w:t>
-      </w:r>
-      <w:proofErr w:type="spellEnd"/>
-      <w:r>
-        <w:rPr>
-          <w:rFonts w:cs="Calibri"/>
-        </w:rPr>
-        <w:t xml:space="preserve"> and </w:t>
-      </w:r>
-      <w:proofErr w:type="spellStart"/>
-      <w:r>
-        <w:rPr>
-          <w:rFonts w:cs="Calibri"/>
-        </w:rPr>
-        <w:t>testing</w:t>
-      </w:r>
-      <w:proofErr w:type="spellEnd"/>
-      <w:r>
-        <w:rPr>
-          <w:rFonts w:cs="Calibri"/>
-        </w:rPr>
-        <w:t xml:space="preserve"> </w:t>
-      </w:r>
-      <w:proofErr w:type="spellStart"/>
-      <w:r>
-        <w:rPr>
-          <w:rFonts w:cs="Calibri"/>
-        </w:rPr>
-        <w:t>procedures</w:t>
-      </w:r>
-      <w:proofErr w:type="spellEnd"/>
-      <w:r>
-        <w:rPr>
-          <w:rFonts w:cs="Calibri"/>
-        </w:rPr>
-        <w:t xml:space="preserve"> (Versión 4.0). https://www.pcisecuritystandards.org/document_library/</w:t>
+        <w:t>Munzenmayer, R. (2026c). Plan de pruebas D-PAY 3.0 (Versión 1.2) [Documento interno]. Duoc UC.</w:t>
       </w:r>
     </w:p>
     <w:p>
@@ -2494,34 +2583,62 @@
         <w:rPr>
           <w:rFonts w:cs="Calibri"/>
         </w:rPr>
-        <w:t xml:space="preserve">Schwaber, K., &amp; Sutherland, J. (2020). The Scrum Guide: The definitive guide </w:t>
+        <w:t xml:space="preserve">PCI Security </w:t>
       </w:r>
       <w:proofErr w:type="spellStart"/>
       <w:r>
         <w:rPr>
           <w:rFonts w:cs="Calibri"/>
         </w:rPr>
-        <w:t>to</w:t>
+        <w:t>Standards</w:t>
       </w:r>
       <w:proofErr w:type="spellEnd"/>
       <w:r>
         <w:rPr>
           <w:rFonts w:cs="Calibri"/>
         </w:rPr>
-        <w:t xml:space="preserve"> Scrum: The rules </w:t>
+        <w:t xml:space="preserve"> Council. (2022). Payment Card </w:t>
       </w:r>
       <w:proofErr w:type="spellStart"/>
       <w:r>
         <w:rPr>
           <w:rFonts w:cs="Calibri"/>
         </w:rPr>
-        <w:t>of</w:t>
+        <w:t>Industry</w:t>
       </w:r>
       <w:proofErr w:type="spellEnd"/>
       <w:r>
         <w:rPr>
           <w:rFonts w:cs="Calibri"/>
         </w:rPr>
+        <w:t xml:space="preserve"> Data Security Standard: </w:t>
+      </w:r>
+      <w:proofErr w:type="spellStart"/>
+      <w:r>
+        <w:rPr>
+          <w:rFonts w:cs="Calibri"/>
+        </w:rPr>
+        <w:t>Requirements</w:t>
+      </w:r>
+      <w:proofErr w:type="spellEnd"/>
+      <w:r>
+        <w:rPr>
+          <w:rFonts w:cs="Calibri"/>
+        </w:rPr>
+        <w:t xml:space="preserve"> and </w:t>
+      </w:r>
+      <w:proofErr w:type="spellStart"/>
+      <w:r>
+        <w:rPr>
+          <w:rFonts w:cs="Calibri"/>
+        </w:rPr>
+        <w:t>testing</w:t>
+      </w:r>
+      <w:proofErr w:type="spellEnd"/>
+      <w:r>
+        <w:rPr>
+          <w:rFonts w:cs="Calibri"/>
+        </w:rPr>
         <w:t xml:space="preserve"> </w:t>
       </w:r>
       <w:proofErr w:type="spellStart"/>
@@ -2529,28 +2646,14 @@
         <w:rPr>
           <w:rFonts w:cs="Calibri"/>
         </w:rPr>
-        <w:t>the</w:t>
+        <w:t>procedures</w:t>
       </w:r>
       <w:proofErr w:type="spellEnd"/>
       <w:r>
         <w:rPr>
           <w:rFonts w:cs="Calibri"/>
         </w:rPr>
-        <w:t xml:space="preserve"> </w:t>
-      </w:r>
-      <w:proofErr w:type="spellStart"/>
-      <w:r>
-        <w:rPr>
-          <w:rFonts w:cs="Calibri"/>
-        </w:rPr>
-        <w:t>game</w:t>
-      </w:r>
-      <w:proofErr w:type="spellEnd"/>
-      <w:r>
-        <w:rPr>
-          <w:rFonts w:cs="Calibri"/>
-        </w:rPr>
-        <w:t>. Scrum.org. https://scrumguides.org/scrum-guide.html</w:t>
+        <w:t xml:space="preserve"> (Versión 4.0). https://www.pcisecuritystandards.org/document_library/</w:t>
       </w:r>
     </w:p>
     <w:p>
@@ -2562,6 +2665,74 @@
         <w:rPr>
           <w:rFonts w:cs="Calibri"/>
         </w:rPr>
+        <w:t xml:space="preserve">Schwaber, K., &amp; Sutherland, J. (2020). The Scrum Guide: The definitive guide </w:t>
+      </w:r>
+      <w:proofErr w:type="spellStart"/>
+      <w:r>
+        <w:rPr>
+          <w:rFonts w:cs="Calibri"/>
+        </w:rPr>
+        <w:t>to</w:t>
+      </w:r>
+      <w:proofErr w:type="spellEnd"/>
+      <w:r>
+        <w:rPr>
+          <w:rFonts w:cs="Calibri"/>
+        </w:rPr>
+        <w:t xml:space="preserve"> Scrum: The rules </w:t>
+      </w:r>
+      <w:proofErr w:type="spellStart"/>
+      <w:r>
+        <w:rPr>
+          <w:rFonts w:cs="Calibri"/>
+        </w:rPr>
+        <w:t>of</w:t>
+      </w:r>
+      <w:proofErr w:type="spellEnd"/>
+      <w:r>
+        <w:rPr>
+          <w:rFonts w:cs="Calibri"/>
+        </w:rPr>
+        <w:t xml:space="preserve"> </w:t>
+      </w:r>
+      <w:proofErr w:type="spellStart"/>
+      <w:r>
+        <w:rPr>
+          <w:rFonts w:cs="Calibri"/>
+        </w:rPr>
+        <w:t>the</w:t>
+      </w:r>
+      <w:proofErr w:type="spellEnd"/>
+      <w:r>
+        <w:rPr>
+          <w:rFonts w:cs="Calibri"/>
+        </w:rPr>
+        <w:t xml:space="preserve"> </w:t>
+      </w:r>
+      <w:proofErr w:type="spellStart"/>
+      <w:r>
+        <w:rPr>
+          <w:rFonts w:cs="Calibri"/>
+        </w:rPr>
+        <w:t>game</w:t>
+      </w:r>
+      <w:proofErr w:type="spellEnd"/>
+      <w:r>
+        <w:rPr>
+          <w:rFonts w:cs="Calibri"/>
+        </w:rPr>
+        <w:t>. Scrum.org. https://scrumguides.org/scrum-guide.html</w:t>
+      </w:r>
+    </w:p>
+    <w:p>
+      <w:pPr>
+        <w:spacing w:after="120"/>
+        <w:ind w:left="720" w:hanging="720"/>
+      </w:pPr>
+      <w:r>
+        <w:rPr>
+          <w:rFonts w:cs="Calibri"/>
+        </w:rPr>
         <w:t xml:space="preserve">Transbank. (s. f.). Webpay Plus. Transbank </w:t>
       </w:r>
       <w:proofErr w:type="spellStart"/>
@@ -2577,6 +2748,26 @@
           <w:rFonts w:cs="Calibri"/>
         </w:rPr>
         <w:t>. Recuperado el 12 de octubre de 2026, de https://www.transbankdevelopers.cl/documentacion/webpay-plus</w:t>
+      </w:r>
+    </w:p>
+    <w:p>
+      <w:pPr>
+        <w:spacing w:after="0" w:line="240" w:lineRule="auto"/>
+        <w:rPr>
+          <w:rFonts w:cs="Calibri"/>
+          <w:b/>
+          <w:color w:val="1F3864"/>
+          <w:sz w:val="28"/>
+        </w:rPr>
+      </w:pPr>
+      <w:r>
+        <w:rPr>
+          <w:rFonts w:cs="Calibri"/>
+          <w:b/>
+          <w:color w:val="1F3864"/>
+          <w:sz w:val="28"/>
+        </w:rPr>
+        <w:br w:type="page"/>
       </w:r>
     </w:p>
     <w:p>
@@ -2928,7 +3119,25 @@
           <w:i/>
           <w:sz w:val="20"/>
         </w:rPr>
-        <w:t>Figura 5. Venta en efectivo con comprobante local. Caso TC-RNF03 (regresión efectivo). Resultado: PASS. Fecha: 27/09/2026. Dispositivo: Celular Android. Origen: Evidencias_dpay\regresion-efectivo-dte\capturas\TC-RNF03_03_comprobante-efectivo_100000_20260927_CelularAndroid.jpg</w:t>
+        <w:t>Figura 5. Venta en efectivo con comprobante local. Caso TC-RNF03 (</w:t>
+      </w:r>
+      <w:proofErr w:type="gramStart"/>
+      <w:r>
+        <w:rPr>
+          <w:rFonts w:cs="Calibri"/>
+          <w:i/>
+          <w:sz w:val="20"/>
+        </w:rPr>
+        <w:t>regresión efectivo</w:t>
+      </w:r>
+      <w:proofErr w:type="gramEnd"/>
+      <w:r>
+        <w:rPr>
+          <w:rFonts w:cs="Calibri"/>
+          <w:i/>
+          <w:sz w:val="20"/>
+        </w:rPr>
+        <w:t>). Resultado: PASS. Fecha: 27/09/2026. Dispositivo: Celular Android. Origen: Evidencias_dpay\regresion-efectivo-dte\capturas\TC-RNF03_03_comprobante-efectivo_100000_20260927_CelularAndroid.jpg</w:t>
       </w:r>
     </w:p>
     <w:p>
@@ -5013,12 +5222,6 @@
 </file>
 
 <file path=customXml/item1.xml><?xml version="1.0" encoding="utf-8"?>
-<p:properties xmlns:p="http://schemas.microsoft.com/office/2006/metadata/properties" xmlns:xsi="http://www.w3.org/2001/XMLSchema-instance" xmlns:pc="http://schemas.microsoft.com/office/infopath/2007/PartnerControls">
-  <documentManagement/>
-</p:properties>
-</file>
-
-<file path=customXml/item2.xml><?xml version="1.0" encoding="utf-8"?>
 <ct:contentTypeSchema xmlns:ct="http://schemas.microsoft.com/office/2006/metadata/contentType" xmlns:ma="http://schemas.microsoft.com/office/2006/metadata/properties/metaAttributes" ct:_="" ma:_="" ma:contentTypeName="Documento" ma:contentTypeID="0x010100E96778489EE7714D8BD12CC105EB918B" ma:contentTypeVersion="2" ma:contentTypeDescription="Crear nuevo documento." ma:contentTypeScope="" ma:versionID="416c5c7ae9b5d54d83875cd3c65194e3">
   <xsd:schema xmlns:xsd="http://www.w3.org/2001/XMLSchema" xmlns:xs="http://www.w3.org/2001/XMLSchema" xmlns:p="http://schemas.microsoft.com/office/2006/metadata/properties" xmlns:ns2="126e8a1c-9ea9-435a-ac89-d06c80d62e30" targetNamespace="http://schemas.microsoft.com/office/2006/metadata/properties" ma:root="true" ma:fieldsID="70a237c842677bd850644f8595079f5e" ns2:_="">
     <xsd:import namespace="126e8a1c-9ea9-435a-ac89-d06c80d62e30"/>
@@ -5150,11 +5353,13 @@
 </ct:contentTypeSchema>
 </file>
 
-<file path=customXml/item3.xml><?xml version="1.0" encoding="utf-8"?>
-<b:Sources xmlns:b="http://schemas.openxmlformats.org/officeDocument/2006/bibliography" xmlns="http://schemas.openxmlformats.org/officeDocument/2006/bibliography" SelectedStyle="\APASixthEditionOfficeOnline.xsl" StyleName="APA" Version="6"/>
+<file path=customXml/item2.xml><?xml version="1.0" encoding="utf-8"?>
+<p:properties xmlns:p="http://schemas.microsoft.com/office/2006/metadata/properties" xmlns:xsi="http://www.w3.org/2001/XMLSchema-instance" xmlns:pc="http://schemas.microsoft.com/office/infopath/2007/PartnerControls">
+  <documentManagement/>
+</p:properties>
 </file>
 
-<file path=customXml/item4.xml><?xml version="1.0" encoding="utf-8"?>
+<file path=customXml/item3.xml><?xml version="1.0" encoding="utf-8"?>
 <?mso-contentType ?>
 <FormTemplates xmlns="http://schemas.microsoft.com/sharepoint/v3/contenttype/forms">
   <Display>DocumentLibraryForm</Display>
@@ -5163,16 +5368,11 @@
 </FormTemplates>
 </file>
 
-<file path=customXml/itemProps1.xml><?xml version="1.0" encoding="utf-8"?>
-<ds:datastoreItem xmlns:ds="http://schemas.openxmlformats.org/officeDocument/2006/customXml" ds:itemID="{372B79FC-6971-4544-98C5-83069028712A}">
-  <ds:schemaRefs>
-    <ds:schemaRef ds:uri="http://schemas.microsoft.com/office/2006/metadata/properties"/>
-    <ds:schemaRef ds:uri="http://schemas.microsoft.com/office/infopath/2007/PartnerControls"/>
-  </ds:schemaRefs>
-</ds:datastoreItem>
+<file path=customXml/item4.xml><?xml version="1.0" encoding="utf-8"?>
+<b:Sources xmlns:b="http://schemas.openxmlformats.org/officeDocument/2006/bibliography" xmlns="http://schemas.openxmlformats.org/officeDocument/2006/bibliography" SelectedStyle="\APASixthEditionOfficeOnline.xsl" StyleName="APA" Version="6"/>
 </file>
 
-<file path=customXml/itemProps2.xml><?xml version="1.0" encoding="utf-8"?>
+<file path=customXml/itemProps1.xml><?xml version="1.0" encoding="utf-8"?>
 <ds:datastoreItem xmlns:ds="http://schemas.openxmlformats.org/officeDocument/2006/customXml" ds:itemID="{1A4E63CB-0BBC-477D-B96D-0B1E89CFECED}">
   <ds:schemaRefs>
     <ds:schemaRef ds:uri="http://schemas.microsoft.com/office/2006/metadata/contentType"/>
@@ -5190,18 +5390,27 @@
 </ds:datastoreItem>
 </file>
 
+<file path=customXml/itemProps2.xml><?xml version="1.0" encoding="utf-8"?>
+<ds:datastoreItem xmlns:ds="http://schemas.openxmlformats.org/officeDocument/2006/customXml" ds:itemID="{372B79FC-6971-4544-98C5-83069028712A}">
+  <ds:schemaRefs>
+    <ds:schemaRef ds:uri="http://schemas.microsoft.com/office/2006/metadata/properties"/>
+    <ds:schemaRef ds:uri="http://schemas.microsoft.com/office/infopath/2007/PartnerControls"/>
+  </ds:schemaRefs>
+</ds:datastoreItem>
+</file>
+
 <file path=customXml/itemProps3.xml><?xml version="1.0" encoding="utf-8"?>
+<ds:datastoreItem xmlns:ds="http://schemas.openxmlformats.org/officeDocument/2006/customXml" ds:itemID="{DB26575A-B7B3-4412-B642-D3B0845180CC}">
+  <ds:schemaRefs>
+    <ds:schemaRef ds:uri="http://schemas.microsoft.com/sharepoint/v3/contenttype/forms"/>
+  </ds:schemaRefs>
+</ds:datastoreItem>
+</file>
+
+<file path=customXml/itemProps4.xml><?xml version="1.0" encoding="utf-8"?>
 <ds:datastoreItem xmlns:ds="http://schemas.openxmlformats.org/officeDocument/2006/customXml" ds:itemID="{BDCED711-E314-4C22-B587-D275DD8897EC}">
   <ds:schemaRefs>
     <ds:schemaRef ds:uri="http://schemas.openxmlformats.org/officeDocument/2006/bibliography"/>
   </ds:schemaRefs>
 </ds:datastoreItem>
-</file>
-
-<file path=customXml/itemProps4.xml><?xml version="1.0" encoding="utf-8"?>
-<ds:datastoreItem xmlns:ds="http://schemas.openxmlformats.org/officeDocument/2006/customXml" ds:itemID="{DB26575A-B7B3-4412-B642-D3B0845180CC}">
-  <ds:schemaRefs>
-    <ds:schemaRef ds:uri="http://schemas.microsoft.com/sharepoint/v3/contenttype/forms"/>
-  </ds:schemaRefs>
-</ds:datastoreItem>
 </file>
</xml_diff>

<commit_message>
docs(fase2): alinea S03 cerrada y tipografia en evidencias APT
Publica Word/md/txt auditados (guion, ver Seccion, Retro S03 15/10, Goal Parcial). Conserva planillas Excel y DAS renombrado.

Co-authored-by: Cursor <cursoragent@cursor.com>
</commit_message>
<xml_diff>
--- a/fase2/Evidencias Grupales/2.6_GuiaEstudiante_Fase 2_Informe Final Proyecto APT.docx
+++ b/fase2/Evidencias Grupales/2.6_GuiaEstudiante_Fase 2_Informe Final Proyecto APT.docx
@@ -267,28 +267,6 @@
     <w:p/>
     <w:p/>
     <w:p/>
-    <w:p>
-      <w:pPr>
-        <w:rPr>
-          <w:rFonts w:asciiTheme="majorHAnsi" w:eastAsiaTheme="majorEastAsia" w:hAnsiTheme="majorHAnsi" w:cstheme="majorBidi"/>
-          <w:b/>
-          <w:color w:val="2F5496" w:themeColor="accent1" w:themeShade="BF"/>
-          <w:sz w:val="26"/>
-          <w:szCs w:val="26"/>
-        </w:rPr>
-      </w:pPr>
-    </w:p>
-    <w:p>
-      <w:pPr>
-        <w:rPr>
-          <w:rFonts w:asciiTheme="majorHAnsi" w:eastAsiaTheme="majorEastAsia" w:hAnsiTheme="majorHAnsi" w:cstheme="majorBidi"/>
-          <w:b/>
-          <w:color w:val="2F5496" w:themeColor="accent1" w:themeShade="BF"/>
-          <w:sz w:val="26"/>
-          <w:szCs w:val="26"/>
-        </w:rPr>
-      </w:pPr>
-    </w:p>
     <w:tbl>
       <w:tblPr>
         <w:tblStyle w:val="Tablaconcuadrcula"/>
@@ -596,6 +574,13 @@
         </w:tc>
       </w:tr>
     </w:tbl>
+    <w:p>
+      <w:pPr>
+        <w:rPr>
+          <w:b/>
+        </w:rPr>
+      </w:pPr>
+    </w:p>
     <w:p>
       <w:pPr>
         <w:rPr>
@@ -645,6 +630,7 @@
                 <w:color w:val="1F3864" w:themeColor="accent1" w:themeShade="80"/>
                 <w:sz w:val="18"/>
               </w:rPr>
+              <w:lastRenderedPageBreak/>
               <w:t>Contenidos de</w:t>
             </w:r>
             <w:r>
@@ -668,7 +654,7 @@
       </w:tr>
       <w:tr>
         <w:trPr>
-          <w:trHeight w:val="2266"/>
+          <w:trHeight w:val="1014"/>
         </w:trPr>
         <w:tc>
           <w:tcPr>
@@ -707,12 +693,7 @@
           <w:p>
             <w:pPr>
               <w:pStyle w:val="paragraph"/>
-              <w:numPr>
-                <w:ilvl w:val="0"/>
-                <w:numId w:val="6"/>
-              </w:numPr>
               <w:spacing w:before="0" w:beforeAutospacing="0" w:after="120" w:afterAutospacing="0" w:line="360" w:lineRule="auto"/>
-              <w:ind w:left="301" w:hanging="283"/>
               <w:jc w:val="both"/>
               <w:textAlignment w:val="baseline"/>
               <w:rPr>
@@ -733,6 +714,9 @@
           <w:p>
             <w:pPr>
               <w:spacing w:after="120"/>
+              <w:rPr>
+                <w:rFonts w:cs="Calibri"/>
+              </w:rPr>
             </w:pPr>
             <w:r>
               <w:rPr>
@@ -763,7 +747,25 @@
               <w:rPr>
                 <w:rFonts w:cs="Calibri"/>
               </w:rPr>
-              <w:t>Dónde se ubica. En Chile, en el mercado de comercios que usan el POS de Dtemite para vender, cobrar y emitir documentos tributarios electrónicos. El mercado de pagos digitales en Chile ha diversificado sus canales (pasarelas web, billeteras digitales y transferencias), y los comercios que dependen solo de hardware físico quedan en desventaja.</w:t>
+              <w:t>¿</w:t>
+            </w:r>
+            <w:r>
+              <w:rPr>
+                <w:rFonts w:cs="Calibri"/>
+              </w:rPr>
+              <w:t>Dónde se ubica</w:t>
+            </w:r>
+            <w:r>
+              <w:rPr>
+                <w:rFonts w:cs="Calibri"/>
+              </w:rPr>
+              <w:t>?; en</w:t>
+            </w:r>
+            <w:r>
+              <w:rPr>
+                <w:rFonts w:cs="Calibri"/>
+              </w:rPr>
+              <w:t xml:space="preserve"> Chile, en el mercado de comercios que usan el POS de Dtemite para vender, cobrar y emitir documentos tributarios electrónicos. El mercado de pagos digitales en Chile ha diversificado sus canales (pasarelas web, billeteras digitales y transferencias), y los comercios que dependen solo de hardware físico quedan en desventaja.</w:t>
             </w:r>
           </w:p>
           <w:p>
@@ -780,12 +782,26 @@
           <w:p>
             <w:pPr>
               <w:spacing w:after="120"/>
-            </w:pPr>
-            <w:r>
-              <w:rPr>
-                <w:rFonts w:cs="Calibri"/>
-              </w:rPr>
-              <w:t>Aporte de valor. Una capa PaymentGateway que ya convive con el cobro TUU/Kozen en producción y agrega Webpay Plus en un celular genérico, con el dato de tarjeta fuera del dispositivo y las credenciales de Transbank fuera del APK. Al 12/10/2026 el valor es demostrable en el ambiente de integración de Transbank (aprobado y rechazado PASS). La operación con comercios reales requiere las credenciales de producción y la emisión de DTE, todavía pendientes.</w:t>
+              <w:rPr>
+                <w:rFonts w:cs="Calibri"/>
+              </w:rPr>
+            </w:pPr>
+            <w:r>
+              <w:rPr>
+                <w:rFonts w:cs="Calibri"/>
+              </w:rPr>
+              <w:t xml:space="preserve">Aporte de valor. Una capa PaymentGateway que ya convive con el cobro TUU/Kozen en producción y agrega Webpay Plus en un celular genérico, con el dato de tarjeta fuera del dispositivo y las credenciales de Transbank fuera del APK. Al 12/10/2026 el valor es demostrable en el ambiente de integración de Transbank (aprobado y rechazado PASS). </w:t>
+            </w:r>
+          </w:p>
+          <w:p>
+            <w:pPr>
+              <w:spacing w:after="120"/>
+            </w:pPr>
+            <w:r>
+              <w:rPr>
+                <w:rFonts w:cs="Calibri"/>
+              </w:rPr>
+              <w:t>La operación con comercios reales requiere las credenciales de producción y la emisión de DTE, todavía pendientes.</w:t>
             </w:r>
           </w:p>
         </w:tc>
@@ -822,13 +838,7 @@
           </w:tcPr>
           <w:p>
             <w:pPr>
-              <w:pStyle w:val="Prrafodelista"/>
-              <w:numPr>
-                <w:ilvl w:val="0"/>
-                <w:numId w:val="1"/>
-              </w:numPr>
               <w:spacing w:after="120"/>
-              <w:ind w:left="314" w:hanging="284"/>
               <w:jc w:val="both"/>
               <w:rPr>
                 <w:rFonts w:cs="Arial"/>
@@ -843,7 +853,19 @@
               <w:rPr>
                 <w:rFonts w:cs="Calibri"/>
               </w:rPr>
-              <w:t>Objetivo general. Diseñar e implementar una arquitectura de pagos extensible para el sistema D-PAY, que permita incorporar múltiples pasarelas de pago digitales de forma desacoplada, utilizando Webpay como implementación mínima viable durante el semestre (Equipo D-PAY 3.0, 2026c).</w:t>
+              <w:t>Objetivo general</w:t>
+            </w:r>
+            <w:r>
+              <w:rPr>
+                <w:rFonts w:cs="Calibri"/>
+              </w:rPr>
+              <w:t>;</w:t>
+            </w:r>
+            <w:r>
+              <w:rPr>
+                <w:rFonts w:cs="Calibri"/>
+              </w:rPr>
+              <w:t xml:space="preserve"> Diseñar e implementar una arquitectura de pagos extensible para el sistema D-PAY, que permita incorporar múltiples pasarelas de pago digitales de forma desacoplada, utilizando Webpay como implementación mínima viable durante el semestre (Equipo D-PAY 3.0, 2026c).</w:t>
             </w:r>
           </w:p>
           <w:p>
@@ -865,7 +887,19 @@
               <w:rPr>
                 <w:rFonts w:cs="Calibri"/>
               </w:rPr>
-              <w:t xml:space="preserve">1. Levantar y documentar la arquitectura de pagos actual de D-PAY y su dependencia del hardware TUU/Kozen — Cumplido (inventario </w:t>
+              <w:t xml:space="preserve">1. Levantar y documentar la arquitectura de pagos actual de D-PAY y su dependencia del hardware TUU/Kozen </w:t>
+            </w:r>
+            <w:r>
+              <w:rPr>
+                <w:rFonts w:cs="Calibri"/>
+              </w:rPr>
+              <w:t>-</w:t>
+            </w:r>
+            <w:r>
+              <w:rPr>
+                <w:rFonts w:cs="Calibri"/>
+              </w:rPr>
+              <w:t xml:space="preserve"> Cumplido (inventario </w:t>
             </w:r>
             <w:proofErr w:type="spellStart"/>
             <w:r>
@@ -904,7 +938,19 @@
               <w:rPr>
                 <w:rFonts w:cs="Calibri"/>
               </w:rPr>
-              <w:t xml:space="preserve"> que desacople la lógica de negocio de cada pasarela — Cumplido (</w:t>
+              <w:t xml:space="preserve"> que desacople la lógica de negocio de cada pasarela </w:t>
+            </w:r>
+            <w:r>
+              <w:rPr>
+                <w:rFonts w:cs="Calibri"/>
+              </w:rPr>
+              <w:t>-</w:t>
+            </w:r>
+            <w:r>
+              <w:rPr>
+                <w:rFonts w:cs="Calibri"/>
+              </w:rPr>
+              <w:t xml:space="preserve"> Cumplido (</w:t>
             </w:r>
             <w:proofErr w:type="spellStart"/>
             <w:r>
@@ -932,7 +978,7 @@
               <w:rPr>
                 <w:rFonts w:cs="Calibri"/>
               </w:rPr>
-              <w:t xml:space="preserve"> y adaptadores, PR #7 a #11; DAS v1.0.2; catálogo RNF v1.0.1).</w:t>
+              <w:t xml:space="preserve"> y adaptadores, PR #7 a #11; DAS v1.0.2; catálogo RNF v1.0.2).</w:t>
             </w:r>
           </w:p>
           <w:p>
@@ -943,7 +989,19 @@
               <w:rPr>
                 <w:rFonts w:cs="Calibri"/>
               </w:rPr>
-              <w:t>3. Implementar la integración con Webpay como MVP funcional dentro de D-PAY — Parcial: aprobado y rechazado PASS (04/10, HU-06); TC-063 parcial; TC-064 bloqueado a la espera de Diego Madrid (TUU/Kozen en producción); DTE pendiente.</w:t>
+              <w:t xml:space="preserve">3. Implementar la integración con Webpay como MVP funcional dentro de D-PAY </w:t>
+            </w:r>
+            <w:r>
+              <w:rPr>
+                <w:rFonts w:cs="Calibri"/>
+              </w:rPr>
+              <w:t>-</w:t>
+            </w:r>
+            <w:r>
+              <w:rPr>
+                <w:rFonts w:cs="Calibri"/>
+              </w:rPr>
+              <w:t xml:space="preserve"> Parcial: aprobado y rechazado PASS (04/10, HU-06); TC-063 parcial; TC-064 / TC-RG-01 Parcial (13/10/2026, Kozen P8 Neo, Diego Madrid); evidencia en Sprint_03/capturas_20261013/; DTE pendiente.</w:t>
             </w:r>
           </w:p>
           <w:p>
@@ -954,7 +1012,19 @@
               <w:rPr>
                 <w:rFonts w:cs="Calibri"/>
               </w:rPr>
-              <w:t>4. Documentar en el Product Backlog las integraciones futuras con Flow, Mercado Pago y PayPal — Cumplido (Product Backlog de la Fase 1).</w:t>
+              <w:t xml:space="preserve">4. Documentar en el Product Backlog las integraciones futuras con Flow, Mercado Pago y PayPal </w:t>
+            </w:r>
+            <w:r>
+              <w:rPr>
+                <w:rFonts w:cs="Calibri"/>
+              </w:rPr>
+              <w:t>-</w:t>
+            </w:r>
+            <w:r>
+              <w:rPr>
+                <w:rFonts w:cs="Calibri"/>
+              </w:rPr>
+              <w:t xml:space="preserve"> Cumplido (Product Backlog de la Fase 1).</w:t>
             </w:r>
           </w:p>
           <w:p>
@@ -979,7 +1049,19 @@
               <w:rPr>
                 <w:rFonts w:cs="Calibri"/>
               </w:rPr>
-              <w:t>, backlog priorizado y ceremonias — En curso: actas S01 y S02 firmadas; Sprint 3 en curso. Git a cargo de Pablo Gutiérrez y Diego Madrid (PR #17).</w:t>
+              <w:t xml:space="preserve">, backlog priorizado y ceremonias </w:t>
+            </w:r>
+            <w:r>
+              <w:rPr>
+                <w:rFonts w:cs="Calibri"/>
+              </w:rPr>
+              <w:t>-</w:t>
+            </w:r>
+            <w:r>
+              <w:rPr>
+                <w:rFonts w:cs="Calibri"/>
+              </w:rPr>
+              <w:t xml:space="preserve"> Actas S01, S02 y S03 firmadas; retrospectiva S03 cerrada 15/10/2026 (Goal Parcial). Git a cargo de Pablo Gutiérrez y Diego Madrid (PR #17).</w:t>
             </w:r>
           </w:p>
         </w:tc>
@@ -1013,13 +1095,7 @@
           </w:tcPr>
           <w:p>
             <w:pPr>
-              <w:pStyle w:val="Prrafodelista"/>
-              <w:numPr>
-                <w:ilvl w:val="0"/>
-                <w:numId w:val="1"/>
-              </w:numPr>
               <w:spacing w:after="120"/>
-              <w:ind w:left="318" w:hanging="284"/>
               <w:jc w:val="both"/>
               <w:rPr>
                 <w:rFonts w:cs="Arial"/>
@@ -1034,7 +1110,19 @@
               <w:rPr>
                 <w:rFonts w:cs="Calibri"/>
               </w:rPr>
-              <w:t xml:space="preserve">Metodología utilizada. Scrum con siete </w:t>
+              <w:t>Metodología utilizada</w:t>
+            </w:r>
+            <w:r>
+              <w:rPr>
+                <w:rFonts w:cs="Calibri"/>
+              </w:rPr>
+              <w:t>;</w:t>
+            </w:r>
+            <w:r>
+              <w:rPr>
+                <w:rFonts w:cs="Calibri"/>
+              </w:rPr>
+              <w:t xml:space="preserve"> Scrum con siete </w:t>
             </w:r>
             <w:proofErr w:type="spellStart"/>
             <w:r>
@@ -1048,22 +1136,16 @@
               <w:rPr>
                 <w:rFonts w:cs="Calibri"/>
               </w:rPr>
-              <w:t xml:space="preserve"> de dos semanas agrupados en tres fases académicas (Schwaber y Sutherland, 2020). José Robles Rocha (Dtemite) es el Product Owner, Pablo Gutiérrez el Scrum Master y el equipo de desarrollo lo forman Diego Madrid, Pablo Gutiérrez y Reinhartd Munzenmayer. Cada sprint tiene un objetivo y cierra con una retrospectiva </w:t>
-            </w:r>
-            <w:proofErr w:type="spellStart"/>
-            <w:r>
-              <w:rPr>
-                <w:rFonts w:cs="Calibri"/>
-              </w:rPr>
-              <w:t>Start</w:t>
-            </w:r>
-            <w:proofErr w:type="spellEnd"/>
-            <w:r>
-              <w:rPr>
-                <w:rFonts w:cs="Calibri"/>
-              </w:rPr>
-              <w:t xml:space="preserve"> / Stop / Continue cuyas acciones quedan con responsable y sprint de destino.</w:t>
-            </w:r>
+              <w:t xml:space="preserve"> de dos semanas agrupados en tres fases académicas (Schwaber y Sutherland, 2020). José Robles Rocha (Dtemite) es el Product Owner, Pablo Gutiérrez el Scrum Master y el equipo de desarrollo lo forman Diego Madrid, Pablo Gutiérrez y Reinhartd Munzenmayer. Cada sprint tiene un objetivo y cierra con una retrospectiva Start / Stop / Continue cuyas acciones quedan con responsable y sprint de destino.</w:t>
+            </w:r>
+          </w:p>
+          <w:p>
+            <w:pPr>
+              <w:spacing w:after="120"/>
+              <w:rPr>
+                <w:rFonts w:cs="Calibri"/>
+              </w:rPr>
+            </w:pPr>
           </w:p>
           <w:p>
             <w:pPr>
@@ -1163,13 +1245,7 @@
           </w:tcPr>
           <w:p>
             <w:pPr>
-              <w:pStyle w:val="Prrafodelista"/>
-              <w:numPr>
-                <w:ilvl w:val="0"/>
-                <w:numId w:val="1"/>
-              </w:numPr>
               <w:spacing w:after="120"/>
-              <w:ind w:left="318" w:hanging="284"/>
               <w:jc w:val="both"/>
               <w:rPr>
                 <w:rFonts w:cs="Arial"/>
@@ -1184,7 +1260,19 @@
               <w:rPr>
                 <w:rFonts w:cs="Calibri"/>
               </w:rPr>
-              <w:t xml:space="preserve">Etapas o actividades. Sprint 1 (08/09–21/09/2026): base </w:t>
+              <w:t>Etapas</w:t>
+            </w:r>
+            <w:r>
+              <w:rPr>
+                <w:rFonts w:cs="Calibri"/>
+              </w:rPr>
+              <w:t xml:space="preserve">; </w:t>
+            </w:r>
+            <w:r>
+              <w:rPr>
+                <w:rFonts w:cs="Calibri"/>
+              </w:rPr>
+              <w:t xml:space="preserve">Sprint 1 (08/09–21/09/2026): base </w:t>
             </w:r>
             <w:proofErr w:type="spellStart"/>
             <w:r>
@@ -1226,7 +1314,7 @@
               <w:rPr>
                 <w:rFonts w:cs="Calibri"/>
               </w:rPr>
-              <w:t xml:space="preserve"> y efectivo operativos (19/09); PR #7 a #11. Sprint 2 (22/09–05/10/2026): cerrar Webpay (rechazo y cancelación), efectivo e inicio de emisión DTE. Parcial: QR y cancelación (03/10), comprobante POS y rechazo (04/10) PASS; DTE no cerrado; PR #12 a #15. Sprint 3 (06/10–17/10/2026): cerrar DTE, historial y nota de crédito; este informe. En curso al 12/10: Jest 17/17; DTE, </w:t>
+              <w:t xml:space="preserve"> y efectivo operativos (19/09); PR #7 a #11. Sprint 2 (22/09–05/10/2026): cerrar Webpay (rechazo y cancelación), efectivo e inicio de emisión DTE. Parcial: QR y cancelación (03/10), comprobante POS y rechazo (04/10) PASS; DTE no cerrado; PR #12 a #15. Sprint 3 (06/10–17/10/2026): cerrar DTE, historial y nota de crédito; este informe. Al corte 18/10/2026: Jest 17/17; DTE, </w:t>
             </w:r>
             <w:proofErr w:type="spellStart"/>
             <w:r>
@@ -1298,6 +1386,22 @@
           <w:p>
             <w:pPr>
               <w:spacing w:after="120"/>
+              <w:rPr>
+                <w:rFonts w:cs="Calibri"/>
+              </w:rPr>
+            </w:pPr>
+          </w:p>
+          <w:p>
+            <w:pPr>
+              <w:spacing w:after="120"/>
+              <w:rPr>
+                <w:rFonts w:cs="Calibri"/>
+              </w:rPr>
+            </w:pPr>
+          </w:p>
+          <w:p>
+            <w:pPr>
+              <w:spacing w:after="120"/>
             </w:pPr>
             <w:r>
               <w:rPr>
@@ -1395,7 +1499,7 @@
               <w:rPr>
                 <w:rFonts w:cs="Calibri"/>
               </w:rPr>
-              <w:t xml:space="preserve"> que apunta al proxy, porque Transbank no entrega un QR nativo. Emisión de DTE movida del Sprint 2 al Sprint 3. Regresión TUU/Kozen cubierta con 17 pruebas unitarias mientras TC-064 sigue bloqueado, en espera de Diego Madrid (TUU/Kozen en producción). Renombre de evidencias del 11/10. </w:t>
+              <w:t xml:space="preserve"> que apunta al proxy, porque Transbank no entrega un QR nativo. Emisión de DTE movida del Sprint 2 al Sprint 3. Regresión TUU/Kozen cubierta con 17 pruebas unitarias con TC-064 / TC-RG-01 Parcial (13/10/2026, Kozen P8 Neo, Diego Madrid) (TUU/Kozen en producción). Renombre de evidencias del 11/10. </w:t>
             </w:r>
             <w:proofErr w:type="spellStart"/>
             <w:r>
@@ -1460,13 +1564,7 @@
           </w:tcPr>
           <w:p>
             <w:pPr>
-              <w:pStyle w:val="Prrafodelista"/>
-              <w:numPr>
-                <w:ilvl w:val="0"/>
-                <w:numId w:val="1"/>
-              </w:numPr>
               <w:spacing w:after="120"/>
-              <w:ind w:left="314" w:hanging="284"/>
               <w:jc w:val="both"/>
               <w:rPr>
                 <w:rFonts w:cs="Arial"/>
@@ -1504,7 +1602,7 @@
               <w:rPr>
                 <w:rFonts w:cs="Calibri"/>
               </w:rPr>
-              <w:t>Diseño: DAS v1.0.2, ADR-002 (Madrid, 2026) y catálogo RNF v1.0.1 (Munzenmayer, 2026a) en 05_Documento_de_Diseno.</w:t>
+              <w:t>Diseño: DAS v1.0.2, ADR-002 (Madrid, 2026) y catálogo RNF v1.0.2 (Munzenmayer, 2026a) en 05_Documento_de_Diseno.</w:t>
             </w:r>
           </w:p>
           <w:p>
@@ -1607,7 +1705,7 @@
               <w:rPr>
                 <w:rFonts w:cs="Calibri"/>
               </w:rPr>
-              <w:t>Pruebas: Plan v1.2, catálogo CSY4111 (15 OK, 2 parciales MTC-12 y MTC-13, 1 NOK, 1 bloqueado de 19), Listado de Defectos v1.2 (Munzenmayer, 2026b, 2026c), Jest 17/17. HU-06: Webpay aprobado y rechazado PASS; TC-063 parcial; TC-064 bloqueado. Figuras 1 a 5 y salida Jest (Figura 6) en el Anexo.</w:t>
+              <w:t>Pruebas: Plan v1.2, catálogo CSY4111 (15 OK, 2 parciales MTC-12 y MTC-13, 1 NOK, 0 bloqueados de 19 (TC-064 Parcial fuera del conteo 15 MTC)), Listado de Defectos v1.2 (Munzenmayer, 2026b, 2026c), Jest 17/17. HU-06: Webpay aprobado y rechazado PASS; TC-063 parcial; TC-064 / TC-RG-01 Parcial (13/10, Kozen). Figuras 1 a 5 y salida Jest (Figura 6) en el Anexo.</w:t>
             </w:r>
           </w:p>
           <w:p>
@@ -1618,7 +1716,7 @@
               <w:rPr>
                 <w:rFonts w:cs="Calibri"/>
               </w:rPr>
-              <w:t>Gestión: actas S01 y S02 firmadas; Retro S03 v0.2. No hay exposición oral ni video demostrativo en esta entrega.</w:t>
+              <w:t>Gestión: actas S01, S02 y S03 firmadas; Retro S03 v0.5. No hay exposición oral ni video demostrativo en esta entrega.</w:t>
             </w:r>
           </w:p>
           <w:p>
@@ -1714,34 +1812,6 @@
           </w:tcPr>
           <w:p>
             <w:pPr>
-              <w:pStyle w:val="Prrafodelista"/>
-              <w:numPr>
-                <w:ilvl w:val="0"/>
-                <w:numId w:val="1"/>
-              </w:numPr>
-              <w:spacing w:after="120"/>
-              <w:ind w:left="314" w:hanging="284"/>
-              <w:jc w:val="both"/>
-              <w:rPr>
-                <w:rFonts w:cs="Arial"/>
-                <w:i/>
-                <w:iCs/>
-                <w:color w:val="0070C0"/>
-                <w:sz w:val="18"/>
-                <w:szCs w:val="18"/>
-                <w:lang w:eastAsia="es-CL"/>
-              </w:rPr>
-            </w:pPr>
-            <w:r>
-              <w:rPr>
-                <w:rFonts w:cs="Calibri"/>
-                <w:i/>
-              </w:rPr>
-              <w:t>Este apartado es individual. Cada integrante redacta su propia reflexión. No se escriben en nombre de Diego Madrid ni de Pablo Gutiérrez.</w:t>
-            </w:r>
-          </w:p>
-          <w:p>
-            <w:pPr>
               <w:spacing w:after="120"/>
             </w:pPr>
             <w:r>
@@ -1801,8 +1871,41 @@
               <w:rPr>
                 <w:rFonts w:cs="Calibri"/>
               </w:rPr>
-              <w:t>, programando y utilizando IA. Ese rumbo se mantiene; quiero profundizar en calidad de software aplicada a pagos (trazabilidad, evidencia auditable y requisitos no funcionales medibles), que es el trabajo que efectivamente hice en HU-06 y en los documentos 06 y 07.</w:t>
-            </w:r>
+              <w:t>, programando y utilizando IA. Ese rumbo se mantiene; quiero profundizar en calidad de software aplicada a pagos (trazabilidad, evidencia auditable y requisitos no funcionales medibles.</w:t>
+            </w:r>
+          </w:p>
+          <w:p>
+            <w:pPr>
+              <w:spacing w:after="120"/>
+              <w:rPr>
+                <w:rFonts w:cs="Calibri"/>
+                <w:b/>
+                <w:color w:val="1F3864"/>
+                <w:sz w:val="24"/>
+              </w:rPr>
+            </w:pPr>
+          </w:p>
+          <w:p>
+            <w:pPr>
+              <w:spacing w:after="120"/>
+              <w:rPr>
+                <w:rFonts w:cs="Calibri"/>
+                <w:b/>
+                <w:color w:val="1F3864"/>
+                <w:sz w:val="24"/>
+              </w:rPr>
+            </w:pPr>
+          </w:p>
+          <w:p>
+            <w:pPr>
+              <w:spacing w:after="120"/>
+              <w:rPr>
+                <w:rFonts w:cs="Calibri"/>
+                <w:b/>
+                <w:color w:val="1F3864"/>
+                <w:sz w:val="24"/>
+              </w:rPr>
+            </w:pPr>
           </w:p>
           <w:p>
             <w:pPr>
@@ -1918,39 +2021,47 @@
     <w:p/>
     <w:p>
       <w:pPr>
-        <w:spacing w:before="280"/>
-      </w:pPr>
-      <w:r>
+        <w:spacing w:after="0" w:line="240" w:lineRule="auto"/>
         <w:rPr>
           <w:rFonts w:cs="Calibri"/>
           <w:b/>
           <w:color w:val="1F3864"/>
           <w:sz w:val="28"/>
         </w:rPr>
-        <w:t>Referencias</w:t>
+      </w:pPr>
+      <w:r>
+        <w:rPr>
+          <w:rFonts w:cs="Calibri"/>
+          <w:b/>
+          <w:color w:val="1F3864"/>
+          <w:sz w:val="28"/>
+        </w:rPr>
+        <w:br w:type="page"/>
       </w:r>
     </w:p>
     <w:p>
       <w:pPr>
-        <w:spacing w:after="120"/>
-      </w:pPr>
-      <w:r>
-        <w:rPr>
-          <w:rFonts w:cs="Calibri"/>
-        </w:rPr>
-        <w:t>Las citas en el texto siguen APA 7. Solo se listan fuentes usadas en este instrumento.</w:t>
+        <w:spacing w:before="280"/>
+      </w:pPr>
+      <w:r>
+        <w:rPr>
+          <w:rFonts w:cs="Calibri"/>
+          <w:b/>
+          <w:color w:val="1F3864"/>
+          <w:sz w:val="28"/>
+        </w:rPr>
+        <w:t>Referencias</w:t>
       </w:r>
     </w:p>
     <w:p>
       <w:pPr>
         <w:spacing w:after="120"/>
-        <w:ind w:left="720" w:hanging="720"/>
-      </w:pPr>
-      <w:r>
-        <w:rPr>
-          <w:rFonts w:cs="Calibri"/>
-        </w:rPr>
-        <w:t>Duoc UC. (2026b). 2.6 Guía del estudiante Fase 2: Informe final Proyecto APT [Guía de asignatura]. Escuela de Informática y Telecomunicaciones.</w:t>
+      </w:pPr>
+      <w:r>
+        <w:rPr>
+          <w:rFonts w:cs="Calibri"/>
+        </w:rPr>
+        <w:t>Las citas en el texto siguen APA 7. Solo se listan fuentes usadas en este instrumento.</w:t>
       </w:r>
     </w:p>
     <w:p>
@@ -1962,7 +2073,7 @@
         <w:rPr>
           <w:rFonts w:cs="Calibri"/>
         </w:rPr>
-        <w:t>Equipo D-PAY 3.0. (2026a). Acta de retrospectiva Sprint 1 [Documento interno firmado, 04/10/2026]. Duoc UC; Dtemite.</w:t>
+        <w:t>Duoc UC. (2026b). 2.6 Guía del estudiante Fase 2: Informe final Proyecto APT [Guía de asignatura]. Escuela de Informática y Telecomunicaciones.</w:t>
       </w:r>
     </w:p>
     <w:p>
@@ -1974,7 +2085,7 @@
         <w:rPr>
           <w:rFonts w:cs="Calibri"/>
         </w:rPr>
-        <w:t>Equipo D-PAY 3.0. (2026b). Acta de retrospectiva Sprint 2 [Documento interno firmado, 04/10/2026]. Duoc UC; Dtemite.</w:t>
+        <w:t>Equipo D-PAY 3.0. (2026a). Acta de retrospectiva Sprint 1 [Documento interno firmado, 04/10/2026]. Duoc UC; Dtemite.</w:t>
       </w:r>
     </w:p>
     <w:p>
@@ -1986,7 +2097,7 @@
         <w:rPr>
           <w:rFonts w:cs="Calibri"/>
         </w:rPr>
-        <w:t>Equipo D-PAY 3.0. (2026d). Informe de avance Fase 2 D-PAY 3.0 [Informe formativo 2.3]. Duoc UC.</w:t>
+        <w:t>Equipo D-PAY 3.0. (2026b). Acta de retrospectiva Sprint 2 [Documento interno firmado, 04/10/2026]. Duoc UC; Dtemite.</w:t>
       </w:r>
     </w:p>
     <w:p>
@@ -1998,21 +2109,7 @@
         <w:rPr>
           <w:rFonts w:cs="Calibri"/>
         </w:rPr>
-        <w:t xml:space="preserve">Equipo D-PAY 3.0. (2026c). Informe de proyecto Fase 1: D-PAY 3.0, evolución hacia una arquitectura de pagos </w:t>
-      </w:r>
-      <w:proofErr w:type="spellStart"/>
-      <w:r>
-        <w:rPr>
-          <w:rFonts w:cs="Calibri"/>
-        </w:rPr>
-        <w:t>multi-gateway</w:t>
-      </w:r>
-      <w:proofErr w:type="spellEnd"/>
-      <w:r>
-        <w:rPr>
-          <w:rFonts w:cs="Calibri"/>
-        </w:rPr>
-        <w:t xml:space="preserve"> [Informe formativo 1.4]. Duoc UC.</w:t>
+        <w:t>Equipo D-PAY 3.0. (2026d). Informe de avance Fase 2 D-PAY 3.0 [Informe formativo 2.3]. Duoc UC.</w:t>
       </w:r>
     </w:p>
     <w:p>
@@ -2024,7 +2121,21 @@
         <w:rPr>
           <w:rFonts w:cs="Calibri"/>
         </w:rPr>
-        <w:t>Gutiérrez, P. (2026). Diario de reflexión Fase 1 [Instrumento 1.2]. Duoc UC.</w:t>
+        <w:t xml:space="preserve">Equipo D-PAY 3.0. (2026c). Informe de proyecto Fase 1: D-PAY 3.0, evolución hacia una arquitectura de pagos </w:t>
+      </w:r>
+      <w:proofErr w:type="spellStart"/>
+      <w:r>
+        <w:rPr>
+          <w:rFonts w:cs="Calibri"/>
+        </w:rPr>
+        <w:t>multi-gateway</w:t>
+      </w:r>
+      <w:proofErr w:type="spellEnd"/>
+      <w:r>
+        <w:rPr>
+          <w:rFonts w:cs="Calibri"/>
+        </w:rPr>
+        <w:t xml:space="preserve"> [Informe formativo 1.4]. Duoc UC.</w:t>
       </w:r>
     </w:p>
     <w:p>
@@ -2036,189 +2147,7 @@
         <w:rPr>
           <w:rFonts w:cs="Calibri"/>
         </w:rPr>
-        <w:t xml:space="preserve">International </w:t>
-      </w:r>
-      <w:proofErr w:type="spellStart"/>
-      <w:r>
-        <w:rPr>
-          <w:rFonts w:cs="Calibri"/>
-        </w:rPr>
-        <w:t>Organization</w:t>
-      </w:r>
-      <w:proofErr w:type="spellEnd"/>
-      <w:r>
-        <w:rPr>
-          <w:rFonts w:cs="Calibri"/>
-        </w:rPr>
-        <w:t xml:space="preserve"> </w:t>
-      </w:r>
-      <w:proofErr w:type="spellStart"/>
-      <w:r>
-        <w:rPr>
-          <w:rFonts w:cs="Calibri"/>
-        </w:rPr>
-        <w:t>for</w:t>
-      </w:r>
-      <w:proofErr w:type="spellEnd"/>
-      <w:r>
-        <w:rPr>
-          <w:rFonts w:cs="Calibri"/>
-        </w:rPr>
-        <w:t xml:space="preserve"> </w:t>
-      </w:r>
-      <w:proofErr w:type="spellStart"/>
-      <w:r>
-        <w:rPr>
-          <w:rFonts w:cs="Calibri"/>
-        </w:rPr>
-        <w:t>Standardization</w:t>
-      </w:r>
-      <w:proofErr w:type="spellEnd"/>
-      <w:r>
-        <w:rPr>
-          <w:rFonts w:cs="Calibri"/>
-        </w:rPr>
-        <w:t xml:space="preserve">. (2011). </w:t>
-      </w:r>
-      <w:proofErr w:type="spellStart"/>
-      <w:r>
-        <w:rPr>
-          <w:rFonts w:cs="Calibri"/>
-        </w:rPr>
-        <w:t>Systems</w:t>
-      </w:r>
-      <w:proofErr w:type="spellEnd"/>
-      <w:r>
-        <w:rPr>
-          <w:rFonts w:cs="Calibri"/>
-        </w:rPr>
-        <w:t xml:space="preserve"> and software </w:t>
-      </w:r>
-      <w:proofErr w:type="spellStart"/>
-      <w:r>
-        <w:rPr>
-          <w:rFonts w:cs="Calibri"/>
-        </w:rPr>
-        <w:t>engineering</w:t>
-      </w:r>
-      <w:proofErr w:type="spellEnd"/>
-      <w:r>
-        <w:rPr>
-          <w:rFonts w:cs="Calibri"/>
-        </w:rPr>
-        <w:t xml:space="preserve"> — </w:t>
-      </w:r>
-      <w:proofErr w:type="spellStart"/>
-      <w:r>
-        <w:rPr>
-          <w:rFonts w:cs="Calibri"/>
-        </w:rPr>
-        <w:t>Systems</w:t>
-      </w:r>
-      <w:proofErr w:type="spellEnd"/>
-      <w:r>
-        <w:rPr>
-          <w:rFonts w:cs="Calibri"/>
-        </w:rPr>
-        <w:t xml:space="preserve"> and software </w:t>
-      </w:r>
-      <w:proofErr w:type="spellStart"/>
-      <w:r>
-        <w:rPr>
-          <w:rFonts w:cs="Calibri"/>
-        </w:rPr>
-        <w:t>Quality</w:t>
-      </w:r>
-      <w:proofErr w:type="spellEnd"/>
-      <w:r>
-        <w:rPr>
-          <w:rFonts w:cs="Calibri"/>
-        </w:rPr>
-        <w:t xml:space="preserve"> </w:t>
-      </w:r>
-      <w:proofErr w:type="spellStart"/>
-      <w:r>
-        <w:rPr>
-          <w:rFonts w:cs="Calibri"/>
-        </w:rPr>
-        <w:t>Requirements</w:t>
-      </w:r>
-      <w:proofErr w:type="spellEnd"/>
-      <w:r>
-        <w:rPr>
-          <w:rFonts w:cs="Calibri"/>
-        </w:rPr>
-        <w:t xml:space="preserve"> and </w:t>
-      </w:r>
-      <w:proofErr w:type="spellStart"/>
-      <w:r>
-        <w:rPr>
-          <w:rFonts w:cs="Calibri"/>
-        </w:rPr>
-        <w:t>Evaluation</w:t>
-      </w:r>
-      <w:proofErr w:type="spellEnd"/>
-      <w:r>
-        <w:rPr>
-          <w:rFonts w:cs="Calibri"/>
-        </w:rPr>
-        <w:t xml:space="preserve"> (</w:t>
-      </w:r>
-      <w:proofErr w:type="spellStart"/>
-      <w:r>
-        <w:rPr>
-          <w:rFonts w:cs="Calibri"/>
-        </w:rPr>
-        <w:t>SQuaRE</w:t>
-      </w:r>
-      <w:proofErr w:type="spellEnd"/>
-      <w:r>
-        <w:rPr>
-          <w:rFonts w:cs="Calibri"/>
-        </w:rPr>
-        <w:t xml:space="preserve">) — </w:t>
-      </w:r>
-      <w:proofErr w:type="spellStart"/>
-      <w:r>
-        <w:rPr>
-          <w:rFonts w:cs="Calibri"/>
-        </w:rPr>
-        <w:t>System</w:t>
-      </w:r>
-      <w:proofErr w:type="spellEnd"/>
-      <w:r>
-        <w:rPr>
-          <w:rFonts w:cs="Calibri"/>
-        </w:rPr>
-        <w:t xml:space="preserve"> and software </w:t>
-      </w:r>
-      <w:proofErr w:type="spellStart"/>
-      <w:r>
-        <w:rPr>
-          <w:rFonts w:cs="Calibri"/>
-        </w:rPr>
-        <w:t>quality</w:t>
-      </w:r>
-      <w:proofErr w:type="spellEnd"/>
-      <w:r>
-        <w:rPr>
-          <w:rFonts w:cs="Calibri"/>
-        </w:rPr>
-        <w:t xml:space="preserve"> </w:t>
-      </w:r>
-      <w:proofErr w:type="spellStart"/>
-      <w:r>
-        <w:rPr>
-          <w:rFonts w:cs="Calibri"/>
-        </w:rPr>
-        <w:t>models</w:t>
-      </w:r>
-      <w:proofErr w:type="spellEnd"/>
-      <w:r>
-        <w:rPr>
-          <w:rFonts w:cs="Calibri"/>
-        </w:rPr>
-        <w:t xml:space="preserve"> (ISO/IEC 25010:2011). https://www.iso.org/standard/35733.html</w:t>
+        <w:t>Gutiérrez, P. (2026). Diario de reflexión Fase 1 [Instrumento 1.2]. Duoc UC.</w:t>
       </w:r>
     </w:p>
     <w:p>
@@ -2272,63 +2201,171 @@
         <w:rPr>
           <w:rFonts w:cs="Calibri"/>
         </w:rPr>
-        <w:t xml:space="preserve">. (2021). Software and </w:t>
+        <w:t xml:space="preserve">. (2011). </w:t>
       </w:r>
       <w:proofErr w:type="spellStart"/>
       <w:r>
         <w:rPr>
           <w:rFonts w:cs="Calibri"/>
         </w:rPr>
-        <w:t>systems</w:t>
+        <w:t>Systems</w:t>
       </w:r>
       <w:proofErr w:type="spellEnd"/>
       <w:r>
         <w:rPr>
           <w:rFonts w:cs="Calibri"/>
         </w:rPr>
+        <w:t xml:space="preserve"> and software </w:t>
+      </w:r>
+      <w:proofErr w:type="spellStart"/>
+      <w:r>
+        <w:rPr>
+          <w:rFonts w:cs="Calibri"/>
+        </w:rPr>
+        <w:t>engineering</w:t>
+      </w:r>
+      <w:proofErr w:type="spellEnd"/>
+      <w:r>
+        <w:rPr>
+          <w:rFonts w:cs="Calibri"/>
+        </w:rPr>
         <w:t xml:space="preserve"> </w:t>
       </w:r>
+      <w:r>
+        <w:rPr>
+          <w:rFonts w:cs="Calibri"/>
+        </w:rPr>
+        <w:t>-</w:t>
+      </w:r>
+      <w:r>
+        <w:rPr>
+          <w:rFonts w:cs="Calibri"/>
+        </w:rPr>
+        <w:t xml:space="preserve"> </w:t>
+      </w:r>
       <w:proofErr w:type="spellStart"/>
       <w:r>
         <w:rPr>
           <w:rFonts w:cs="Calibri"/>
         </w:rPr>
-        <w:t>engineering</w:t>
+        <w:t>Systems</w:t>
       </w:r>
       <w:proofErr w:type="spellEnd"/>
       <w:r>
         <w:rPr>
           <w:rFonts w:cs="Calibri"/>
         </w:rPr>
-        <w:t xml:space="preserve"> — Software </w:t>
+        <w:t xml:space="preserve"> and software </w:t>
       </w:r>
       <w:proofErr w:type="spellStart"/>
       <w:r>
         <w:rPr>
           <w:rFonts w:cs="Calibri"/>
         </w:rPr>
-        <w:t>testing</w:t>
+        <w:t>Quality</w:t>
       </w:r>
       <w:proofErr w:type="spellEnd"/>
       <w:r>
         <w:rPr>
           <w:rFonts w:cs="Calibri"/>
         </w:rPr>
-        <w:t xml:space="preserve"> — Part 3: Test </w:t>
+        <w:t xml:space="preserve"> </w:t>
       </w:r>
       <w:proofErr w:type="spellStart"/>
       <w:r>
         <w:rPr>
           <w:rFonts w:cs="Calibri"/>
         </w:rPr>
-        <w:t>documentation</w:t>
+        <w:t>Requirements</w:t>
       </w:r>
       <w:proofErr w:type="spellEnd"/>
       <w:r>
         <w:rPr>
           <w:rFonts w:cs="Calibri"/>
         </w:rPr>
-        <w:t xml:space="preserve"> (ISO/IEC/IEEE 29119-3:2021). https://www.iso.org/standard/79429.html</w:t>
+        <w:t xml:space="preserve"> and </w:t>
+      </w:r>
+      <w:proofErr w:type="spellStart"/>
+      <w:r>
+        <w:rPr>
+          <w:rFonts w:cs="Calibri"/>
+        </w:rPr>
+        <w:t>Evaluation</w:t>
+      </w:r>
+      <w:proofErr w:type="spellEnd"/>
+      <w:r>
+        <w:rPr>
+          <w:rFonts w:cs="Calibri"/>
+        </w:rPr>
+        <w:t xml:space="preserve"> (</w:t>
+      </w:r>
+      <w:proofErr w:type="spellStart"/>
+      <w:r>
+        <w:rPr>
+          <w:rFonts w:cs="Calibri"/>
+        </w:rPr>
+        <w:t>SQuaRE</w:t>
+      </w:r>
+      <w:proofErr w:type="spellEnd"/>
+      <w:r>
+        <w:rPr>
+          <w:rFonts w:cs="Calibri"/>
+        </w:rPr>
+        <w:t xml:space="preserve">) </w:t>
+      </w:r>
+      <w:r>
+        <w:rPr>
+          <w:rFonts w:cs="Calibri"/>
+        </w:rPr>
+        <w:t>-</w:t>
+      </w:r>
+      <w:r>
+        <w:rPr>
+          <w:rFonts w:cs="Calibri"/>
+        </w:rPr>
+        <w:t xml:space="preserve"> </w:t>
+      </w:r>
+      <w:proofErr w:type="spellStart"/>
+      <w:r>
+        <w:rPr>
+          <w:rFonts w:cs="Calibri"/>
+        </w:rPr>
+        <w:t>System</w:t>
+      </w:r>
+      <w:proofErr w:type="spellEnd"/>
+      <w:r>
+        <w:rPr>
+          <w:rFonts w:cs="Calibri"/>
+        </w:rPr>
+        <w:t xml:space="preserve"> and software </w:t>
+      </w:r>
+      <w:proofErr w:type="spellStart"/>
+      <w:r>
+        <w:rPr>
+          <w:rFonts w:cs="Calibri"/>
+        </w:rPr>
+        <w:t>quality</w:t>
+      </w:r>
+      <w:proofErr w:type="spellEnd"/>
+      <w:r>
+        <w:rPr>
+          <w:rFonts w:cs="Calibri"/>
+        </w:rPr>
+        <w:t xml:space="preserve"> </w:t>
+      </w:r>
+      <w:proofErr w:type="spellStart"/>
+      <w:r>
+        <w:rPr>
+          <w:rFonts w:cs="Calibri"/>
+        </w:rPr>
+        <w:t>models</w:t>
+      </w:r>
+      <w:proofErr w:type="spellEnd"/>
+      <w:r>
+        <w:rPr>
+          <w:rFonts w:cs="Calibri"/>
+        </w:rPr>
+        <w:t xml:space="preserve"> (ISO/IEC 25010:2011). https://www.iso.org/standard/35733.html</w:t>
       </w:r>
     </w:p>
     <w:p>
@@ -2340,7 +2377,129 @@
         <w:rPr>
           <w:rFonts w:cs="Calibri"/>
         </w:rPr>
-        <w:t>Madrid, D. (2026). Documento de Arquitectura del Sistema D-PAY 3.0 (Versión 1.0.2) [Documento interno]. Dtemite.</w:t>
+        <w:t xml:space="preserve">International </w:t>
+      </w:r>
+      <w:proofErr w:type="spellStart"/>
+      <w:r>
+        <w:rPr>
+          <w:rFonts w:cs="Calibri"/>
+        </w:rPr>
+        <w:t>Organization</w:t>
+      </w:r>
+      <w:proofErr w:type="spellEnd"/>
+      <w:r>
+        <w:rPr>
+          <w:rFonts w:cs="Calibri"/>
+        </w:rPr>
+        <w:t xml:space="preserve"> </w:t>
+      </w:r>
+      <w:proofErr w:type="spellStart"/>
+      <w:r>
+        <w:rPr>
+          <w:rFonts w:cs="Calibri"/>
+        </w:rPr>
+        <w:t>for</w:t>
+      </w:r>
+      <w:proofErr w:type="spellEnd"/>
+      <w:r>
+        <w:rPr>
+          <w:rFonts w:cs="Calibri"/>
+        </w:rPr>
+        <w:t xml:space="preserve"> </w:t>
+      </w:r>
+      <w:proofErr w:type="spellStart"/>
+      <w:r>
+        <w:rPr>
+          <w:rFonts w:cs="Calibri"/>
+        </w:rPr>
+        <w:t>Standardization</w:t>
+      </w:r>
+      <w:proofErr w:type="spellEnd"/>
+      <w:r>
+        <w:rPr>
+          <w:rFonts w:cs="Calibri"/>
+        </w:rPr>
+        <w:t xml:space="preserve">. (2021). Software and </w:t>
+      </w:r>
+      <w:proofErr w:type="spellStart"/>
+      <w:r>
+        <w:rPr>
+          <w:rFonts w:cs="Calibri"/>
+        </w:rPr>
+        <w:t>systems</w:t>
+      </w:r>
+      <w:proofErr w:type="spellEnd"/>
+      <w:r>
+        <w:rPr>
+          <w:rFonts w:cs="Calibri"/>
+        </w:rPr>
+        <w:t xml:space="preserve"> </w:t>
+      </w:r>
+      <w:proofErr w:type="spellStart"/>
+      <w:r>
+        <w:rPr>
+          <w:rFonts w:cs="Calibri"/>
+        </w:rPr>
+        <w:t>engineering</w:t>
+      </w:r>
+      <w:proofErr w:type="spellEnd"/>
+      <w:r>
+        <w:rPr>
+          <w:rFonts w:cs="Calibri"/>
+        </w:rPr>
+        <w:t xml:space="preserve"> </w:t>
+      </w:r>
+      <w:r>
+        <w:rPr>
+          <w:rFonts w:cs="Calibri"/>
+        </w:rPr>
+        <w:t>-</w:t>
+      </w:r>
+      <w:r>
+        <w:rPr>
+          <w:rFonts w:cs="Calibri"/>
+        </w:rPr>
+        <w:t xml:space="preserve"> Software </w:t>
+      </w:r>
+      <w:proofErr w:type="spellStart"/>
+      <w:r>
+        <w:rPr>
+          <w:rFonts w:cs="Calibri"/>
+        </w:rPr>
+        <w:t>testing</w:t>
+      </w:r>
+      <w:proofErr w:type="spellEnd"/>
+      <w:r>
+        <w:rPr>
+          <w:rFonts w:cs="Calibri"/>
+        </w:rPr>
+        <w:t xml:space="preserve"> </w:t>
+      </w:r>
+      <w:r>
+        <w:rPr>
+          <w:rFonts w:cs="Calibri"/>
+        </w:rPr>
+        <w:t>-</w:t>
+      </w:r>
+      <w:r>
+        <w:rPr>
+          <w:rFonts w:cs="Calibri"/>
+        </w:rPr>
+        <w:t xml:space="preserve"> Part 3: Test </w:t>
+      </w:r>
+      <w:proofErr w:type="spellStart"/>
+      <w:r>
+        <w:rPr>
+          <w:rFonts w:cs="Calibri"/>
+        </w:rPr>
+        <w:t>documentation</w:t>
+      </w:r>
+      <w:proofErr w:type="spellEnd"/>
+      <w:r>
+        <w:rPr>
+          <w:rFonts w:cs="Calibri"/>
+        </w:rPr>
+        <w:t xml:space="preserve"> (ISO/IEC/IEEE 29119-3:2021). https://www.iso.org/standard/79429.html</w:t>
       </w:r>
     </w:p>
     <w:p>
@@ -2352,7 +2511,7 @@
         <w:rPr>
           <w:rFonts w:cs="Calibri"/>
         </w:rPr>
-        <w:t>Madrid, D. (2026). Diario de reflexión Fase 1 [Instrumento 1.2]. Duoc UC. (Además del DAS v1.0.2 citado más abajo.)</w:t>
+        <w:t>Madrid, D. (2026). Documento de Arquitectura del Sistema D-PAY 3.0 (Versión 1.0.2) [Documento interno]. Dtemite.</w:t>
       </w:r>
     </w:p>
     <w:p>
@@ -2364,7 +2523,7 @@
         <w:rPr>
           <w:rFonts w:cs="Calibri"/>
         </w:rPr>
-        <w:t>Munzenmayer, R. (2026a). Catálogo de requisitos no funcionales ISO/IEC 25010 D-PAY 3.0 (Versión 1.0.1) [Documento interno]. Duoc UC.</w:t>
+        <w:t>Madrid, D. (2026). Diario de reflexión Fase 1 [Instrumento 1.2]. Duoc UC. (Además del DAS v1.0.2 citado más abajo.)</w:t>
       </w:r>
     </w:p>
     <w:p>
@@ -2376,7 +2535,7 @@
         <w:rPr>
           <w:rFonts w:cs="Calibri"/>
         </w:rPr>
-        <w:t>Munzenmayer, R. (2026d). Diario de reflexión Fase 1 [Instrumento 1.2]. Duoc UC.</w:t>
+        <w:t>Munzenmayer, R. (2026a). Catálogo de requisitos no funcionales ISO/IEC 25010 D-PAY 3.0 (Versión 1.0.2) [Documento interno]. Duoc UC.</w:t>
       </w:r>
     </w:p>
     <w:p>
@@ -2388,7 +2547,7 @@
         <w:rPr>
           <w:rFonts w:cs="Calibri"/>
         </w:rPr>
-        <w:t>Munzenmayer, R. (2026b). Listado de defectos D-PAY 3.0 (Versión 1.2) [Documento interno]. Duoc UC.</w:t>
+        <w:t>Munzenmayer, R. (2026d). Diario de reflexión Fase 1 [Instrumento 1.2]. Duoc UC.</w:t>
       </w:r>
     </w:p>
     <w:p>
@@ -2400,7 +2559,7 @@
         <w:rPr>
           <w:rFonts w:cs="Calibri"/>
         </w:rPr>
-        <w:t>Munzenmayer, R. (2026c). Plan de pruebas D-PAY 3.0 (Versión 1.2) [Documento interno]. Duoc UC.</w:t>
+        <w:t>Munzenmayer, R. (2026b). Listado de defectos D-PAY 3.0 (Versión 1.2) [Documento interno]. Duoc UC.</w:t>
       </w:r>
     </w:p>
     <w:p>
@@ -2412,77 +2571,7 @@
         <w:rPr>
           <w:rFonts w:cs="Calibri"/>
         </w:rPr>
-        <w:t xml:space="preserve">PCI Security </w:t>
-      </w:r>
-      <w:proofErr w:type="spellStart"/>
-      <w:r>
-        <w:rPr>
-          <w:rFonts w:cs="Calibri"/>
-        </w:rPr>
-        <w:t>Standards</w:t>
-      </w:r>
-      <w:proofErr w:type="spellEnd"/>
-      <w:r>
-        <w:rPr>
-          <w:rFonts w:cs="Calibri"/>
-        </w:rPr>
-        <w:t xml:space="preserve"> Council. (2022). Payment Card </w:t>
-      </w:r>
-      <w:proofErr w:type="spellStart"/>
-      <w:r>
-        <w:rPr>
-          <w:rFonts w:cs="Calibri"/>
-        </w:rPr>
-        <w:t>Industry</w:t>
-      </w:r>
-      <w:proofErr w:type="spellEnd"/>
-      <w:r>
-        <w:rPr>
-          <w:rFonts w:cs="Calibri"/>
-        </w:rPr>
-        <w:t xml:space="preserve"> Data Security Standard: </w:t>
-      </w:r>
-      <w:proofErr w:type="spellStart"/>
-      <w:r>
-        <w:rPr>
-          <w:rFonts w:cs="Calibri"/>
-        </w:rPr>
-        <w:t>Requirements</w:t>
-      </w:r>
-      <w:proofErr w:type="spellEnd"/>
-      <w:r>
-        <w:rPr>
-          <w:rFonts w:cs="Calibri"/>
-        </w:rPr>
-        <w:t xml:space="preserve"> and </w:t>
-      </w:r>
-      <w:proofErr w:type="spellStart"/>
-      <w:r>
-        <w:rPr>
-          <w:rFonts w:cs="Calibri"/>
-        </w:rPr>
-        <w:t>testing</w:t>
-      </w:r>
-      <w:proofErr w:type="spellEnd"/>
-      <w:r>
-        <w:rPr>
-          <w:rFonts w:cs="Calibri"/>
-        </w:rPr>
-        <w:t xml:space="preserve"> </w:t>
-      </w:r>
-      <w:proofErr w:type="spellStart"/>
-      <w:r>
-        <w:rPr>
-          <w:rFonts w:cs="Calibri"/>
-        </w:rPr>
-        <w:t>procedures</w:t>
-      </w:r>
-      <w:proofErr w:type="spellEnd"/>
-      <w:r>
-        <w:rPr>
-          <w:rFonts w:cs="Calibri"/>
-        </w:rPr>
-        <w:t xml:space="preserve"> (Versión 4.0). https://www.pcisecuritystandards.org/document_library/</w:t>
+        <w:t>Munzenmayer, R. (2026c). Plan de pruebas D-PAY 3.0 (Versión 1.2) [Documento interno]. Duoc UC.</w:t>
       </w:r>
     </w:p>
     <w:p>
@@ -2494,34 +2583,62 @@
         <w:rPr>
           <w:rFonts w:cs="Calibri"/>
         </w:rPr>
-        <w:t xml:space="preserve">Schwaber, K., &amp; Sutherland, J. (2020). The Scrum Guide: The definitive guide </w:t>
+        <w:t xml:space="preserve">PCI Security </w:t>
       </w:r>
       <w:proofErr w:type="spellStart"/>
       <w:r>
         <w:rPr>
           <w:rFonts w:cs="Calibri"/>
         </w:rPr>
-        <w:t>to</w:t>
+        <w:t>Standards</w:t>
       </w:r>
       <w:proofErr w:type="spellEnd"/>
       <w:r>
         <w:rPr>
           <w:rFonts w:cs="Calibri"/>
         </w:rPr>
-        <w:t xml:space="preserve"> Scrum: The rules </w:t>
+        <w:t xml:space="preserve"> Council. (2022). Payment Card </w:t>
       </w:r>
       <w:proofErr w:type="spellStart"/>
       <w:r>
         <w:rPr>
           <w:rFonts w:cs="Calibri"/>
         </w:rPr>
-        <w:t>of</w:t>
+        <w:t>Industry</w:t>
       </w:r>
       <w:proofErr w:type="spellEnd"/>
       <w:r>
         <w:rPr>
           <w:rFonts w:cs="Calibri"/>
         </w:rPr>
+        <w:t xml:space="preserve"> Data Security Standard: </w:t>
+      </w:r>
+      <w:proofErr w:type="spellStart"/>
+      <w:r>
+        <w:rPr>
+          <w:rFonts w:cs="Calibri"/>
+        </w:rPr>
+        <w:t>Requirements</w:t>
+      </w:r>
+      <w:proofErr w:type="spellEnd"/>
+      <w:r>
+        <w:rPr>
+          <w:rFonts w:cs="Calibri"/>
+        </w:rPr>
+        <w:t xml:space="preserve"> and </w:t>
+      </w:r>
+      <w:proofErr w:type="spellStart"/>
+      <w:r>
+        <w:rPr>
+          <w:rFonts w:cs="Calibri"/>
+        </w:rPr>
+        <w:t>testing</w:t>
+      </w:r>
+      <w:proofErr w:type="spellEnd"/>
+      <w:r>
+        <w:rPr>
+          <w:rFonts w:cs="Calibri"/>
+        </w:rPr>
         <w:t xml:space="preserve"> </w:t>
       </w:r>
       <w:proofErr w:type="spellStart"/>
@@ -2529,28 +2646,14 @@
         <w:rPr>
           <w:rFonts w:cs="Calibri"/>
         </w:rPr>
-        <w:t>the</w:t>
+        <w:t>procedures</w:t>
       </w:r>
       <w:proofErr w:type="spellEnd"/>
       <w:r>
         <w:rPr>
           <w:rFonts w:cs="Calibri"/>
         </w:rPr>
-        <w:t xml:space="preserve"> </w:t>
-      </w:r>
-      <w:proofErr w:type="spellStart"/>
-      <w:r>
-        <w:rPr>
-          <w:rFonts w:cs="Calibri"/>
-        </w:rPr>
-        <w:t>game</w:t>
-      </w:r>
-      <w:proofErr w:type="spellEnd"/>
-      <w:r>
-        <w:rPr>
-          <w:rFonts w:cs="Calibri"/>
-        </w:rPr>
-        <w:t>. Scrum.org. https://scrumguides.org/scrum-guide.html</w:t>
+        <w:t xml:space="preserve"> (Versión 4.0). https://www.pcisecuritystandards.org/document_library/</w:t>
       </w:r>
     </w:p>
     <w:p>
@@ -2562,6 +2665,74 @@
         <w:rPr>
           <w:rFonts w:cs="Calibri"/>
         </w:rPr>
+        <w:t xml:space="preserve">Schwaber, K., &amp; Sutherland, J. (2020). The Scrum Guide: The definitive guide </w:t>
+      </w:r>
+      <w:proofErr w:type="spellStart"/>
+      <w:r>
+        <w:rPr>
+          <w:rFonts w:cs="Calibri"/>
+        </w:rPr>
+        <w:t>to</w:t>
+      </w:r>
+      <w:proofErr w:type="spellEnd"/>
+      <w:r>
+        <w:rPr>
+          <w:rFonts w:cs="Calibri"/>
+        </w:rPr>
+        <w:t xml:space="preserve"> Scrum: The rules </w:t>
+      </w:r>
+      <w:proofErr w:type="spellStart"/>
+      <w:r>
+        <w:rPr>
+          <w:rFonts w:cs="Calibri"/>
+        </w:rPr>
+        <w:t>of</w:t>
+      </w:r>
+      <w:proofErr w:type="spellEnd"/>
+      <w:r>
+        <w:rPr>
+          <w:rFonts w:cs="Calibri"/>
+        </w:rPr>
+        <w:t xml:space="preserve"> </w:t>
+      </w:r>
+      <w:proofErr w:type="spellStart"/>
+      <w:r>
+        <w:rPr>
+          <w:rFonts w:cs="Calibri"/>
+        </w:rPr>
+        <w:t>the</w:t>
+      </w:r>
+      <w:proofErr w:type="spellEnd"/>
+      <w:r>
+        <w:rPr>
+          <w:rFonts w:cs="Calibri"/>
+        </w:rPr>
+        <w:t xml:space="preserve"> </w:t>
+      </w:r>
+      <w:proofErr w:type="spellStart"/>
+      <w:r>
+        <w:rPr>
+          <w:rFonts w:cs="Calibri"/>
+        </w:rPr>
+        <w:t>game</w:t>
+      </w:r>
+      <w:proofErr w:type="spellEnd"/>
+      <w:r>
+        <w:rPr>
+          <w:rFonts w:cs="Calibri"/>
+        </w:rPr>
+        <w:t>. Scrum.org. https://scrumguides.org/scrum-guide.html</w:t>
+      </w:r>
+    </w:p>
+    <w:p>
+      <w:pPr>
+        <w:spacing w:after="120"/>
+        <w:ind w:left="720" w:hanging="720"/>
+      </w:pPr>
+      <w:r>
+        <w:rPr>
+          <w:rFonts w:cs="Calibri"/>
+        </w:rPr>
         <w:t xml:space="preserve">Transbank. (s. f.). Webpay Plus. Transbank </w:t>
       </w:r>
       <w:proofErr w:type="spellStart"/>
@@ -2577,6 +2748,26 @@
           <w:rFonts w:cs="Calibri"/>
         </w:rPr>
         <w:t>. Recuperado el 12 de octubre de 2026, de https://www.transbankdevelopers.cl/documentacion/webpay-plus</w:t>
+      </w:r>
+    </w:p>
+    <w:p>
+      <w:pPr>
+        <w:spacing w:after="0" w:line="240" w:lineRule="auto"/>
+        <w:rPr>
+          <w:rFonts w:cs="Calibri"/>
+          <w:b/>
+          <w:color w:val="1F3864"/>
+          <w:sz w:val="28"/>
+        </w:rPr>
+      </w:pPr>
+      <w:r>
+        <w:rPr>
+          <w:rFonts w:cs="Calibri"/>
+          <w:b/>
+          <w:color w:val="1F3864"/>
+          <w:sz w:val="28"/>
+        </w:rPr>
+        <w:br w:type="page"/>
       </w:r>
     </w:p>
     <w:p>
@@ -2928,7 +3119,25 @@
           <w:i/>
           <w:sz w:val="20"/>
         </w:rPr>
-        <w:t>Figura 5. Venta en efectivo con comprobante local. Caso TC-RNF03 (regresión efectivo). Resultado: PASS. Fecha: 27/09/2026. Dispositivo: Celular Android. Origen: Evidencias_dpay\regresion-efectivo-dte\capturas\TC-RNF03_03_comprobante-efectivo_100000_20260927_CelularAndroid.jpg</w:t>
+        <w:t>Figura 5. Venta en efectivo con comprobante local. Caso TC-RNF03 (</w:t>
+      </w:r>
+      <w:proofErr w:type="gramStart"/>
+      <w:r>
+        <w:rPr>
+          <w:rFonts w:cs="Calibri"/>
+          <w:i/>
+          <w:sz w:val="20"/>
+        </w:rPr>
+        <w:t>regresión efectivo</w:t>
+      </w:r>
+      <w:proofErr w:type="gramEnd"/>
+      <w:r>
+        <w:rPr>
+          <w:rFonts w:cs="Calibri"/>
+          <w:i/>
+          <w:sz w:val="20"/>
+        </w:rPr>
+        <w:t>). Resultado: PASS. Fecha: 27/09/2026. Dispositivo: Celular Android. Origen: Evidencias_dpay\regresion-efectivo-dte\capturas\TC-RNF03_03_comprobante-efectivo_100000_20260927_CelularAndroid.jpg</w:t>
       </w:r>
     </w:p>
     <w:p>
@@ -5013,12 +5222,6 @@
 </file>
 
 <file path=customXml/item1.xml><?xml version="1.0" encoding="utf-8"?>
-<p:properties xmlns:p="http://schemas.microsoft.com/office/2006/metadata/properties" xmlns:xsi="http://www.w3.org/2001/XMLSchema-instance" xmlns:pc="http://schemas.microsoft.com/office/infopath/2007/PartnerControls">
-  <documentManagement/>
-</p:properties>
-</file>
-
-<file path=customXml/item2.xml><?xml version="1.0" encoding="utf-8"?>
 <ct:contentTypeSchema xmlns:ct="http://schemas.microsoft.com/office/2006/metadata/contentType" xmlns:ma="http://schemas.microsoft.com/office/2006/metadata/properties/metaAttributes" ct:_="" ma:_="" ma:contentTypeName="Documento" ma:contentTypeID="0x010100E96778489EE7714D8BD12CC105EB918B" ma:contentTypeVersion="2" ma:contentTypeDescription="Crear nuevo documento." ma:contentTypeScope="" ma:versionID="416c5c7ae9b5d54d83875cd3c65194e3">
   <xsd:schema xmlns:xsd="http://www.w3.org/2001/XMLSchema" xmlns:xs="http://www.w3.org/2001/XMLSchema" xmlns:p="http://schemas.microsoft.com/office/2006/metadata/properties" xmlns:ns2="126e8a1c-9ea9-435a-ac89-d06c80d62e30" targetNamespace="http://schemas.microsoft.com/office/2006/metadata/properties" ma:root="true" ma:fieldsID="70a237c842677bd850644f8595079f5e" ns2:_="">
     <xsd:import namespace="126e8a1c-9ea9-435a-ac89-d06c80d62e30"/>
@@ -5150,11 +5353,13 @@
 </ct:contentTypeSchema>
 </file>
 
-<file path=customXml/item3.xml><?xml version="1.0" encoding="utf-8"?>
-<b:Sources xmlns:b="http://schemas.openxmlformats.org/officeDocument/2006/bibliography" xmlns="http://schemas.openxmlformats.org/officeDocument/2006/bibliography" SelectedStyle="\APASixthEditionOfficeOnline.xsl" StyleName="APA" Version="6"/>
+<file path=customXml/item2.xml><?xml version="1.0" encoding="utf-8"?>
+<p:properties xmlns:p="http://schemas.microsoft.com/office/2006/metadata/properties" xmlns:xsi="http://www.w3.org/2001/XMLSchema-instance" xmlns:pc="http://schemas.microsoft.com/office/infopath/2007/PartnerControls">
+  <documentManagement/>
+</p:properties>
 </file>
 
-<file path=customXml/item4.xml><?xml version="1.0" encoding="utf-8"?>
+<file path=customXml/item3.xml><?xml version="1.0" encoding="utf-8"?>
 <?mso-contentType ?>
 <FormTemplates xmlns="http://schemas.microsoft.com/sharepoint/v3/contenttype/forms">
   <Display>DocumentLibraryForm</Display>
@@ -5163,16 +5368,11 @@
 </FormTemplates>
 </file>
 
-<file path=customXml/itemProps1.xml><?xml version="1.0" encoding="utf-8"?>
-<ds:datastoreItem xmlns:ds="http://schemas.openxmlformats.org/officeDocument/2006/customXml" ds:itemID="{372B79FC-6971-4544-98C5-83069028712A}">
-  <ds:schemaRefs>
-    <ds:schemaRef ds:uri="http://schemas.microsoft.com/office/2006/metadata/properties"/>
-    <ds:schemaRef ds:uri="http://schemas.microsoft.com/office/infopath/2007/PartnerControls"/>
-  </ds:schemaRefs>
-</ds:datastoreItem>
+<file path=customXml/item4.xml><?xml version="1.0" encoding="utf-8"?>
+<b:Sources xmlns:b="http://schemas.openxmlformats.org/officeDocument/2006/bibliography" xmlns="http://schemas.openxmlformats.org/officeDocument/2006/bibliography" SelectedStyle="\APASixthEditionOfficeOnline.xsl" StyleName="APA" Version="6"/>
 </file>
 
-<file path=customXml/itemProps2.xml><?xml version="1.0" encoding="utf-8"?>
+<file path=customXml/itemProps1.xml><?xml version="1.0" encoding="utf-8"?>
 <ds:datastoreItem xmlns:ds="http://schemas.openxmlformats.org/officeDocument/2006/customXml" ds:itemID="{1A4E63CB-0BBC-477D-B96D-0B1E89CFECED}">
   <ds:schemaRefs>
     <ds:schemaRef ds:uri="http://schemas.microsoft.com/office/2006/metadata/contentType"/>
@@ -5190,18 +5390,27 @@
 </ds:datastoreItem>
 </file>
 
+<file path=customXml/itemProps2.xml><?xml version="1.0" encoding="utf-8"?>
+<ds:datastoreItem xmlns:ds="http://schemas.openxmlformats.org/officeDocument/2006/customXml" ds:itemID="{372B79FC-6971-4544-98C5-83069028712A}">
+  <ds:schemaRefs>
+    <ds:schemaRef ds:uri="http://schemas.microsoft.com/office/2006/metadata/properties"/>
+    <ds:schemaRef ds:uri="http://schemas.microsoft.com/office/infopath/2007/PartnerControls"/>
+  </ds:schemaRefs>
+</ds:datastoreItem>
+</file>
+
 <file path=customXml/itemProps3.xml><?xml version="1.0" encoding="utf-8"?>
+<ds:datastoreItem xmlns:ds="http://schemas.openxmlformats.org/officeDocument/2006/customXml" ds:itemID="{DB26575A-B7B3-4412-B642-D3B0845180CC}">
+  <ds:schemaRefs>
+    <ds:schemaRef ds:uri="http://schemas.microsoft.com/sharepoint/v3/contenttype/forms"/>
+  </ds:schemaRefs>
+</ds:datastoreItem>
+</file>
+
+<file path=customXml/itemProps4.xml><?xml version="1.0" encoding="utf-8"?>
 <ds:datastoreItem xmlns:ds="http://schemas.openxmlformats.org/officeDocument/2006/customXml" ds:itemID="{BDCED711-E314-4C22-B587-D275DD8897EC}">
   <ds:schemaRefs>
     <ds:schemaRef ds:uri="http://schemas.openxmlformats.org/officeDocument/2006/bibliography"/>
   </ds:schemaRefs>
 </ds:datastoreItem>
-</file>
-
-<file path=customXml/itemProps4.xml><?xml version="1.0" encoding="utf-8"?>
-<ds:datastoreItem xmlns:ds="http://schemas.openxmlformats.org/officeDocument/2006/customXml" ds:itemID="{DB26575A-B7B3-4412-B642-D3B0845180CC}">
-  <ds:schemaRefs>
-    <ds:schemaRef ds:uri="http://schemas.microsoft.com/sharepoint/v3/contenttype/forms"/>
-  </ds:schemaRefs>
-</ds:datastoreItem>
 </file>
</xml_diff>